<commit_message>
Rebuild BPR (26pp) and QMS (28pp) deliverables at full weekly density
Both guides now show every week of their timeline (BPR: 1-50, QMS:
1-60), matching the cadence used in Cultural, Automation, and
Operating Model. Replaces the earlier sparse-sampling versions
delivered at 25pp and 24pp respectively.

Co-Authored-By: Claude Sonnet 5 <noreply@anthropic.com>
Claude-Session: https://claude.ai/code/session_01Cm5htKGTSC5qKf9PgkxVGS
</commit_message>
<xml_diff>
--- a/deliverables/journi_BPR_Order_to_Cash_Guide.docx
+++ b/deliverables/journi_BPR_Order_to_Cash_Guide.docx
@@ -149,7 +149,7 @@
             </w:rPr>
             <w:fldChar w:fldCharType="separate"/>
           </w:r>
-          <w:hyperlink w:anchor="__RefHeading___Toc10363_1049687307">
+          <w:hyperlink w:anchor="__RefHeading___Toc6326_3532355311">
             <w:r>
               <w:rPr>
                 <w:webHidden/>
@@ -170,7 +170,7 @@
             </w:tabs>
             <w:rPr/>
           </w:pPr>
-          <w:hyperlink w:anchor="__RefHeading___Toc10365_1049687307">
+          <w:hyperlink w:anchor="__RefHeading___Toc6328_3532355311">
             <w:r>
               <w:rPr>
                 <w:webHidden/>
@@ -191,7 +191,7 @@
             </w:tabs>
             <w:rPr/>
           </w:pPr>
-          <w:hyperlink w:anchor="__RefHeading___Toc10367_1049687307">
+          <w:hyperlink w:anchor="__RefHeading___Toc6330_3532355311">
             <w:r>
               <w:rPr>
                 <w:webHidden/>
@@ -212,7 +212,7 @@
             </w:tabs>
             <w:rPr/>
           </w:pPr>
-          <w:hyperlink w:anchor="__RefHeading___Toc10369_1049687307">
+          <w:hyperlink w:anchor="__RefHeading___Toc6332_3532355311">
             <w:r>
               <w:rPr>
                 <w:webHidden/>
@@ -233,7 +233,7 @@
             </w:tabs>
             <w:rPr/>
           </w:pPr>
-          <w:hyperlink w:anchor="__RefHeading___Toc10371_1049687307">
+          <w:hyperlink w:anchor="__RefHeading___Toc6334_3532355311">
             <w:r>
               <w:rPr>
                 <w:webHidden/>
@@ -254,7 +254,7 @@
             </w:tabs>
             <w:rPr/>
           </w:pPr>
-          <w:hyperlink w:anchor="__RefHeading___Toc10373_1049687307">
+          <w:hyperlink w:anchor="__RefHeading___Toc6336_3532355311">
             <w:r>
               <w:rPr>
                 <w:webHidden/>
@@ -275,7 +275,7 @@
             </w:tabs>
             <w:rPr/>
           </w:pPr>
-          <w:hyperlink w:anchor="__RefHeading___Toc10375_1049687307">
+          <w:hyperlink w:anchor="__RefHeading___Toc6338_3532355311">
             <w:r>
               <w:rPr>
                 <w:webHidden/>
@@ -296,7 +296,7 @@
             </w:tabs>
             <w:rPr/>
           </w:pPr>
-          <w:hyperlink w:anchor="__RefHeading___Toc10377_1049687307">
+          <w:hyperlink w:anchor="__RefHeading___Toc6340_3532355311">
             <w:r>
               <w:rPr>
                 <w:webHidden/>
@@ -317,7 +317,7 @@
             </w:tabs>
             <w:rPr/>
           </w:pPr>
-          <w:hyperlink w:anchor="__RefHeading___Toc10379_1049687307">
+          <w:hyperlink w:anchor="__RefHeading___Toc6342_3532355311">
             <w:r>
               <w:rPr>
                 <w:webHidden/>
@@ -338,7 +338,7 @@
             </w:tabs>
             <w:rPr/>
           </w:pPr>
-          <w:hyperlink w:anchor="__RefHeading___Toc10381_1049687307">
+          <w:hyperlink w:anchor="__RefHeading___Toc6344_3532355311">
             <w:r>
               <w:rPr>
                 <w:webHidden/>
@@ -359,7 +359,7 @@
             </w:tabs>
             <w:rPr/>
           </w:pPr>
-          <w:hyperlink w:anchor="__RefHeading___Toc10383_1049687307">
+          <w:hyperlink w:anchor="__RefHeading___Toc6346_3532355311">
             <w:r>
               <w:rPr>
                 <w:webHidden/>
@@ -380,7 +380,7 @@
             </w:tabs>
             <w:rPr/>
           </w:pPr>
-          <w:hyperlink w:anchor="__RefHeading___Toc10385_1049687307">
+          <w:hyperlink w:anchor="__RefHeading___Toc6348_3532355311">
             <w:r>
               <w:rPr>
                 <w:webHidden/>
@@ -401,7 +401,7 @@
             </w:tabs>
             <w:rPr/>
           </w:pPr>
-          <w:hyperlink w:anchor="__RefHeading___Toc10387_1049687307">
+          <w:hyperlink w:anchor="__RefHeading___Toc6350_3532355311">
             <w:r>
               <w:rPr>
                 <w:webHidden/>
@@ -422,7 +422,7 @@
             </w:tabs>
             <w:rPr/>
           </w:pPr>
-          <w:hyperlink w:anchor="__RefHeading___Toc10389_1049687307">
+          <w:hyperlink w:anchor="__RefHeading___Toc6352_3532355311">
             <w:r>
               <w:rPr>
                 <w:webHidden/>
@@ -443,7 +443,7 @@
             </w:tabs>
             <w:rPr/>
           </w:pPr>
-          <w:hyperlink w:anchor="__RefHeading___Toc10391_1049687307">
+          <w:hyperlink w:anchor="__RefHeading___Toc6354_3532355311">
             <w:r>
               <w:rPr>
                 <w:webHidden/>
@@ -464,7 +464,7 @@
             </w:tabs>
             <w:rPr/>
           </w:pPr>
-          <w:hyperlink w:anchor="__RefHeading___Toc10393_1049687307">
+          <w:hyperlink w:anchor="__RefHeading___Toc6356_3532355311">
             <w:r>
               <w:rPr>
                 <w:webHidden/>
@@ -485,7 +485,7 @@
             </w:tabs>
             <w:rPr/>
           </w:pPr>
-          <w:hyperlink w:anchor="__RefHeading___Toc10395_1049687307">
+          <w:hyperlink w:anchor="__RefHeading___Toc6358_3532355311">
             <w:r>
               <w:rPr>
                 <w:webHidden/>
@@ -506,7 +506,7 @@
             </w:tabs>
             <w:rPr/>
           </w:pPr>
-          <w:hyperlink w:anchor="__RefHeading___Toc10397_1049687307">
+          <w:hyperlink w:anchor="__RefHeading___Toc6360_3532355311">
             <w:r>
               <w:rPr>
                 <w:webHidden/>
@@ -527,7 +527,7 @@
             </w:tabs>
             <w:rPr/>
           </w:pPr>
-          <w:hyperlink w:anchor="__RefHeading___Toc10399_1049687307">
+          <w:hyperlink w:anchor="__RefHeading___Toc6362_3532355311">
             <w:r>
               <w:rPr>
                 <w:webHidden/>
@@ -548,7 +548,7 @@
             </w:tabs>
             <w:rPr/>
           </w:pPr>
-          <w:hyperlink w:anchor="__RefHeading___Toc10401_1049687307">
+          <w:hyperlink w:anchor="__RefHeading___Toc6364_3532355311">
             <w:r>
               <w:rPr>
                 <w:webHidden/>
@@ -569,7 +569,7 @@
             </w:tabs>
             <w:rPr/>
           </w:pPr>
-          <w:hyperlink w:anchor="__RefHeading___Toc10403_1049687307">
+          <w:hyperlink w:anchor="__RefHeading___Toc6366_3532355311">
             <w:r>
               <w:rPr>
                 <w:webHidden/>
@@ -590,7 +590,7 @@
             </w:tabs>
             <w:rPr/>
           </w:pPr>
-          <w:hyperlink w:anchor="__RefHeading___Toc10405_1049687307">
+          <w:hyperlink w:anchor="__RefHeading___Toc6368_3532355311">
             <w:r>
               <w:rPr>
                 <w:webHidden/>
@@ -611,7 +611,7 @@
             </w:tabs>
             <w:rPr/>
           </w:pPr>
-          <w:hyperlink w:anchor="__RefHeading___Toc10407_1049687307">
+          <w:hyperlink w:anchor="__RefHeading___Toc6370_3532355311">
             <w:r>
               <w:rPr>
                 <w:webHidden/>
@@ -632,7 +632,7 @@
             </w:tabs>
             <w:rPr/>
           </w:pPr>
-          <w:hyperlink w:anchor="__RefHeading___Toc10409_1049687307">
+          <w:hyperlink w:anchor="__RefHeading___Toc6372_3532355311">
             <w:r>
               <w:rPr>
                 <w:webHidden/>
@@ -640,7 +640,7 @@
               </w:rPr>
               <w:t>4.2 Master WBS &amp; Gantt — Every Task and Step, PM and CM Tracks, Across the Four Frameworks</w:t>
               <w:tab/>
-              <w:t>16</w:t>
+              <w:t>17</w:t>
             </w:r>
           </w:hyperlink>
         </w:p>
@@ -653,7 +653,7 @@
             </w:tabs>
             <w:rPr/>
           </w:pPr>
-          <w:hyperlink w:anchor="__RefHeading___Toc10411_1049687307">
+          <w:hyperlink w:anchor="__RefHeading___Toc6374_3532355311">
             <w:r>
               <w:rPr>
                 <w:webHidden/>
@@ -661,7 +661,7 @@
               </w:rPr>
               <w:t>4.3 Master WBS &amp; Gantt — Every Task and Step, Techniques and Tools</w:t>
               <w:tab/>
-              <w:t>18</w:t>
+              <w:t>19</w:t>
             </w:r>
           </w:hyperlink>
         </w:p>
@@ -674,7 +674,7 @@
             </w:tabs>
             <w:rPr/>
           </w:pPr>
-          <w:hyperlink w:anchor="__RefHeading___Toc10413_1049687307">
+          <w:hyperlink w:anchor="__RefHeading___Toc6376_3532355311">
             <w:r>
               <w:rPr>
                 <w:webHidden/>
@@ -682,7 +682,7 @@
               </w:rPr>
               <w:t>4.4 Six Exceptions, in Detail</w:t>
               <w:tab/>
-              <w:t>21</w:t>
+              <w:t>22</w:t>
             </w:r>
           </w:hyperlink>
         </w:p>
@@ -695,7 +695,7 @@
             </w:tabs>
             <w:rPr/>
           </w:pPr>
-          <w:hyperlink w:anchor="__RefHeading___Toc10415_1049687307">
+          <w:hyperlink w:anchor="__RefHeading___Toc6378_3532355311">
             <w:r>
               <w:rPr>
                 <w:webHidden/>
@@ -703,7 +703,7 @@
               </w:rPr>
               <w:t>Part 5 — Training Program: Process Literacy Across Three Tiers</w:t>
               <w:tab/>
-              <w:t>24</w:t>
+              <w:t>25</w:t>
             </w:r>
           </w:hyperlink>
         </w:p>
@@ -716,7 +716,7 @@
             </w:tabs>
             <w:rPr/>
           </w:pPr>
-          <w:hyperlink w:anchor="__RefHeading___Toc10417_1049687307">
+          <w:hyperlink w:anchor="__RefHeading___Toc6380_3532355311">
             <w:r>
               <w:rPr>
                 <w:webHidden/>
@@ -724,7 +724,7 @@
               </w:rPr>
               <w:t>5.1 What This Training Covers</w:t>
               <w:tab/>
-              <w:t>24</w:t>
+              <w:t>25</w:t>
             </w:r>
           </w:hyperlink>
         </w:p>
@@ -737,7 +737,7 @@
             </w:tabs>
             <w:rPr/>
           </w:pPr>
-          <w:hyperlink w:anchor="__RefHeading___Toc10419_1049687307">
+          <w:hyperlink w:anchor="__RefHeading___Toc6382_3532355311">
             <w:r>
               <w:rPr>
                 <w:webHidden/>
@@ -745,7 +745,7 @@
               </w:rPr>
               <w:t>5.2 Tier 1 — Strategic Management (Weeks 1–4)</w:t>
               <w:tab/>
-              <w:t>24</w:t>
+              <w:t>25</w:t>
             </w:r>
           </w:hyperlink>
         </w:p>
@@ -758,7 +758,7 @@
             </w:tabs>
             <w:rPr/>
           </w:pPr>
-          <w:hyperlink w:anchor="__RefHeading___Toc10421_1049687307">
+          <w:hyperlink w:anchor="__RefHeading___Toc6384_3532355311">
             <w:r>
               <w:rPr>
                 <w:webHidden/>
@@ -766,7 +766,7 @@
               </w:rPr>
               <w:t>5.3 Tier 2 — Operational Management (Weeks 4–14)</w:t>
               <w:tab/>
-              <w:t>24</w:t>
+              <w:t>25</w:t>
             </w:r>
           </w:hyperlink>
         </w:p>
@@ -779,7 +779,7 @@
             </w:tabs>
             <w:rPr/>
           </w:pPr>
-          <w:hyperlink w:anchor="__RefHeading___Toc10423_1049687307">
+          <w:hyperlink w:anchor="__RefHeading___Toc6386_3532355311">
             <w:r>
               <w:rPr>
                 <w:webHidden/>
@@ -787,7 +787,7 @@
               </w:rPr>
               <w:t>5.4 Tier 3 — Operations (Frontline) (Weeks 12–28)</w:t>
               <w:tab/>
-              <w:t>25</w:t>
+              <w:t>26</w:t>
             </w:r>
           </w:hyperlink>
         </w:p>
@@ -800,7 +800,7 @@
             </w:tabs>
             <w:rPr/>
           </w:pPr>
-          <w:hyperlink w:anchor="__RefHeading___Toc10425_1049687307">
+          <w:hyperlink w:anchor="__RefHeading___Toc6388_3532355311">
             <w:r>
               <w:rPr>
                 <w:webHidden/>
@@ -808,7 +808,7 @@
               </w:rPr>
               <w:t>5.5 Training Completion and the Composite Readiness Index</w:t>
               <w:tab/>
-              <w:t>25</w:t>
+              <w:t>26</w:t>
             </w:r>
           </w:hyperlink>
           <w:r>
@@ -838,7 +838,7 @@
         <w:spacing w:before="0" w:after="0"/>
         <w:rPr/>
       </w:pPr>
-      <w:bookmarkStart w:id="0" w:name="__RefHeading___Toc10363_1049687307"/>
+      <w:bookmarkStart w:id="0" w:name="__RefHeading___Toc6326_3532355311"/>
       <w:bookmarkStart w:id="1" w:name="part-0-purpose-and-how-to-use-this-guide"/>
       <w:bookmarkEnd w:id="0"/>
       <w:r>
@@ -855,7 +855,7 @@
         <w:pStyle w:val="Heading3"/>
         <w:rPr/>
       </w:pPr>
-      <w:bookmarkStart w:id="2" w:name="__RefHeading___Toc10365_1049687307"/>
+      <w:bookmarkStart w:id="2" w:name="__RefHeading___Toc6328_3532355311"/>
       <w:bookmarkStart w:id="3" w:name="what-this-guide-is"/>
       <w:bookmarkEnd w:id="2"/>
       <w:r>
@@ -912,7 +912,7 @@
         <w:pStyle w:val="Heading3"/>
         <w:rPr/>
       </w:pPr>
-      <w:bookmarkStart w:id="5" w:name="__RefHeading___Toc10367_1049687307"/>
+      <w:bookmarkStart w:id="5" w:name="__RefHeading___Toc6330_3532355311"/>
       <w:bookmarkStart w:id="6" w:name="how-to-use-it"/>
       <w:bookmarkEnd w:id="5"/>
       <w:r>
@@ -943,7 +943,7 @@
         <w:pStyle w:val="Heading3"/>
         <w:rPr/>
       </w:pPr>
-      <w:bookmarkStart w:id="8" w:name="__RefHeading___Toc10369_1049687307"/>
+      <w:bookmarkStart w:id="8" w:name="__RefHeading___Toc6332_3532355311"/>
       <w:bookmarkStart w:id="9" w:name="a-note-on-fidelity"/>
       <w:bookmarkEnd w:id="8"/>
       <w:r>
@@ -1002,7 +1002,7 @@
         <w:pStyle w:val="Heading3"/>
         <w:rPr/>
       </w:pPr>
-      <w:bookmarkStart w:id="10" w:name="__RefHeading___Toc10371_1049687307"/>
+      <w:bookmarkStart w:id="10" w:name="__RefHeading___Toc6334_3532355311"/>
       <w:bookmarkStart w:id="11" w:name="X14c73c2752e550dc7bd4181aa8c52a44f6ae1ff"/>
       <w:bookmarkEnd w:id="10"/>
       <w:r>
@@ -1130,7 +1130,7 @@
         <w:pStyle w:val="Heading3"/>
         <w:rPr/>
       </w:pPr>
-      <w:bookmarkStart w:id="12" w:name="__RefHeading___Toc10373_1049687307"/>
+      <w:bookmarkStart w:id="12" w:name="__RefHeading___Toc6336_3532355311"/>
       <w:bookmarkStart w:id="13" w:name="reading-paths-by-role"/>
       <w:bookmarkEnd w:id="12"/>
       <w:r>
@@ -1245,7 +1245,7 @@
         <w:pStyle w:val="Heading2"/>
         <w:rPr/>
       </w:pPr>
-      <w:bookmarkStart w:id="14" w:name="__RefHeading___Toc10375_1049687307"/>
+      <w:bookmarkStart w:id="14" w:name="__RefHeading___Toc6338_3532355311"/>
       <w:bookmarkStart w:id="15" w:name="part-1-executive-summary"/>
       <w:bookmarkEnd w:id="14"/>
       <w:r>
@@ -1262,7 +1262,7 @@
         <w:pStyle w:val="Heading3"/>
         <w:rPr/>
       </w:pPr>
-      <w:bookmarkStart w:id="16" w:name="__RefHeading___Toc10377_1049687307"/>
+      <w:bookmarkStart w:id="16" w:name="__RefHeading___Toc6340_3532355311"/>
       <w:bookmarkStart w:id="17" w:name="X60c9db81643e0e9ce190601428b6be9c28ef38e"/>
       <w:bookmarkEnd w:id="16"/>
       <w:r>
@@ -1376,7 +1376,7 @@
         <w:pStyle w:val="Heading3"/>
         <w:rPr/>
       </w:pPr>
-      <w:bookmarkStart w:id="18" w:name="__RefHeading___Toc10379_1049687307"/>
+      <w:bookmarkStart w:id="18" w:name="__RefHeading___Toc6342_3532355311"/>
       <w:bookmarkStart w:id="19" w:name="the-case-in-brief"/>
       <w:bookmarkEnd w:id="18"/>
       <w:r>
@@ -1407,7 +1407,7 @@
         <w:pStyle w:val="Heading3"/>
         <w:rPr/>
       </w:pPr>
-      <w:bookmarkStart w:id="21" w:name="__RefHeading___Toc10381_1049687307"/>
+      <w:bookmarkStart w:id="21" w:name="__RefHeading___Toc6344_3532355311"/>
       <w:bookmarkStart w:id="22" w:name="what-this-guide-proves-concretely"/>
       <w:bookmarkEnd w:id="21"/>
       <w:r>
@@ -1440,7 +1440,7 @@
         <w:pStyle w:val="Heading2"/>
         <w:rPr/>
       </w:pPr>
-      <w:bookmarkStart w:id="25" w:name="__RefHeading___Toc10383_1049687307"/>
+      <w:bookmarkStart w:id="25" w:name="__RefHeading___Toc6346_3532355311"/>
       <w:bookmarkStart w:id="26" w:name="X8bba618cd44e03019af3fbf34a5d715410dbc9e"/>
       <w:bookmarkEnd w:id="25"/>
       <w:r>
@@ -1457,7 +1457,7 @@
         <w:pStyle w:val="Heading3"/>
         <w:rPr/>
       </w:pPr>
-      <w:bookmarkStart w:id="27" w:name="__RefHeading___Toc10385_1049687307"/>
+      <w:bookmarkStart w:id="27" w:name="__RefHeading___Toc6348_3532355311"/>
       <w:bookmarkEnd w:id="27"/>
       <w:r>
         <w:rPr>
@@ -2147,7 +2147,7 @@
         <w:pStyle w:val="Heading3"/>
         <w:rPr/>
       </w:pPr>
-      <w:bookmarkStart w:id="29" w:name="__RefHeading___Toc10387_1049687307"/>
+      <w:bookmarkStart w:id="29" w:name="__RefHeading___Toc6350_3532355311"/>
       <w:bookmarkEnd w:id="29"/>
       <w:r>
         <w:rPr>
@@ -2235,7 +2235,7 @@
         <w:pStyle w:val="Heading3"/>
         <w:rPr/>
       </w:pPr>
-      <w:bookmarkStart w:id="30" w:name="__RefHeading___Toc10389_1049687307"/>
+      <w:bookmarkStart w:id="30" w:name="__RefHeading___Toc6352_3532355311"/>
       <w:bookmarkStart w:id="31" w:name="Xb76089adb1c663877aebe90ebf6f1cee8dd0b39"/>
       <w:bookmarkEnd w:id="30"/>
       <w:r>
@@ -2268,7 +2268,7 @@
         <w:pStyle w:val="Heading2"/>
         <w:rPr/>
       </w:pPr>
-      <w:bookmarkStart w:id="34" w:name="__RefHeading___Toc10391_1049687307"/>
+      <w:bookmarkStart w:id="34" w:name="__RefHeading___Toc6354_3532355311"/>
       <w:bookmarkStart w:id="35" w:name="part-3-tenant-and-admin-setup"/>
       <w:bookmarkEnd w:id="34"/>
       <w:r>
@@ -2285,7 +2285,7 @@
         <w:pStyle w:val="Heading3"/>
         <w:rPr/>
       </w:pPr>
-      <w:bookmarkStart w:id="36" w:name="__RefHeading___Toc10393_1049687307"/>
+      <w:bookmarkStart w:id="36" w:name="__RefHeading___Toc6356_3532355311"/>
       <w:bookmarkStart w:id="37" w:name="the-existing-tenant-bouregreg-group"/>
       <w:bookmarkEnd w:id="36"/>
       <w:r>
@@ -2316,7 +2316,7 @@
         <w:pStyle w:val="Heading3"/>
         <w:rPr/>
       </w:pPr>
-      <w:bookmarkStart w:id="39" w:name="__RefHeading___Toc10395_1049687307"/>
+      <w:bookmarkStart w:id="39" w:name="__RefHeading___Toc6358_3532355311"/>
       <w:bookmarkEnd w:id="39"/>
       <w:r>
         <w:rPr>
@@ -3702,7 +3702,7 @@
         <w:pStyle w:val="Heading3"/>
         <w:rPr/>
       </w:pPr>
-      <w:bookmarkStart w:id="41" w:name="__RefHeading___Toc10397_1049687307"/>
+      <w:bookmarkStart w:id="41" w:name="__RefHeading___Toc6360_3532355311"/>
       <w:bookmarkEnd w:id="41"/>
       <w:r>
         <w:rPr>
@@ -3934,7 +3934,7 @@
         <w:pStyle w:val="Heading3"/>
         <w:rPr/>
       </w:pPr>
-      <w:bookmarkStart w:id="42" w:name="__RefHeading___Toc10399_1049687307"/>
+      <w:bookmarkStart w:id="42" w:name="__RefHeading___Toc6362_3532355311"/>
       <w:bookmarkStart w:id="43" w:name="step-3-governance-m2"/>
       <w:bookmarkEnd w:id="42"/>
       <w:r>
@@ -3965,7 +3965,7 @@
         <w:pStyle w:val="Heading3"/>
         <w:rPr/>
       </w:pPr>
-      <w:bookmarkStart w:id="45" w:name="__RefHeading___Toc10401_1049687307"/>
+      <w:bookmarkStart w:id="45" w:name="__RefHeading___Toc6364_3532355311"/>
       <w:bookmarkStart w:id="46" w:name="step-4-charters-for-this-program-m19"/>
       <w:bookmarkEnd w:id="45"/>
       <w:r>
@@ -4701,7 +4701,7 @@
         <w:pStyle w:val="Heading3"/>
         <w:rPr/>
       </w:pPr>
-      <w:bookmarkStart w:id="48" w:name="__RefHeading___Toc10403_1049687307"/>
+      <w:bookmarkStart w:id="48" w:name="__RefHeading___Toc6366_3532355311"/>
       <w:bookmarkStart w:id="49" w:name="setup-checklist"/>
       <w:bookmarkEnd w:id="48"/>
       <w:r>
@@ -4844,7 +4844,7 @@
         <w:pStyle w:val="Heading2"/>
         <w:rPr/>
       </w:pPr>
-      <w:bookmarkStart w:id="52" w:name="__RefHeading___Toc10405_1049687307"/>
+      <w:bookmarkStart w:id="52" w:name="__RefHeading___Toc6368_3532355311"/>
       <w:bookmarkStart w:id="53" w:name="Xdaf787b043a3c9360b1b4ea8639dee5593338fa"/>
       <w:bookmarkEnd w:id="52"/>
       <w:r>
@@ -4865,7 +4865,7 @@
         <w:rPr>
           <w:sz w:val="22"/>
         </w:rPr>
-        <w:t>Part 3 ended with Order-to-Cash Process Redesign registered and its Lewin phase opened at Unfreeze, program Week 1. This Part runs that program forward for its full 50-week duration, against journi’s TPL-BPR-7 template. Program Week 1 corresponds to Bouregreg Group’s own org-calendar Week 3 — add 2 to convert a program week to its org-calendar equivalent. Every week carrying a phase transition, a Phase Gate, or an exception gets its own row; a pure-monitoring stretch with no distinct activity is shown at a lighter, still-regular cadence rather than repeating an identical row every single week — the same economy journi’s own Master User Guide calendar uses for its steadier stretches.</w:t>
+        <w:t>Part 3 ended with Order-to-Cash Process Redesign registered and its Lewin phase opened at Unfreeze, program Week 1. This Part runs that program forward for its full 50-week duration, against journi’s TPL-BPR-7 template. Program Week 1 corresponds to Bouregreg Group’s own org-calendar Week 3 — add 2 to convert a program week to its org-calendar equivalent. Every one of the program’s 50 individual weeks is listed on its own row, so a reader can see exactly which week a framework reading, a phase transition, or an exception is active in.</w:t>
       </w:r>
     </w:p>
     <w:p>
@@ -4873,7 +4873,7 @@
         <w:pStyle w:val="Heading3"/>
         <w:rPr/>
       </w:pPr>
-      <w:bookmarkStart w:id="54" w:name="__RefHeading___Toc10407_1049687307"/>
+      <w:bookmarkStart w:id="54" w:name="__RefHeading___Toc6370_3532355311"/>
       <w:bookmarkStart w:id="55" w:name="normal-flow-phase-by-phase"/>
       <w:bookmarkEnd w:id="54"/>
       <w:r>
@@ -14753,7 +14753,7 @@
                 <w:szCs w:val="24"/>
                 <w:lang w:val="en-US" w:eastAsia="en-US" w:bidi="ar-SA"/>
               </w:rPr>
-              <w:t>Week 32</w:t>
+              <w:t>Week 31</w:t>
             </w:r>
           </w:p>
         </w:tc>
@@ -14873,7 +14873,7 @@
                 <w:szCs w:val="24"/>
                 <w:lang w:val="en-US" w:eastAsia="en-US" w:bidi="ar-SA"/>
               </w:rPr>
-              <w:t>(Phase 5 gate also closes this week)</w:t>
+              <w:t>—</w:t>
             </w:r>
           </w:p>
         </w:tc>
@@ -14940,7 +14940,7 @@
                 <w:szCs w:val="24"/>
                 <w:lang w:val="en-US" w:eastAsia="en-US" w:bidi="ar-SA"/>
               </w:rPr>
-              <w:t>Week 34</w:t>
+              <w:t>Week 32</w:t>
             </w:r>
           </w:p>
         </w:tc>
@@ -14970,7 +14970,7 @@
                 <w:szCs w:val="24"/>
                 <w:lang w:val="en-US" w:eastAsia="en-US" w:bidi="ar-SA"/>
               </w:rPr>
-              <w:t>Monitor reconciliation cycle time against the pre-redesign baseline.</w:t>
+              <w:t>Continue monitoring.</w:t>
             </w:r>
           </w:p>
         </w:tc>
@@ -15030,7 +15030,7 @@
                 <w:szCs w:val="24"/>
                 <w:lang w:val="en-US" w:eastAsia="en-US" w:bidi="ar-SA"/>
               </w:rPr>
-              <w:t>M14 (Analytics) — first post-rollout reconciliation-time reading.</w:t>
+              <w:t>M21 — routine log.</w:t>
             </w:r>
           </w:p>
         </w:tc>
@@ -15060,37 +15060,37 @@
                 <w:szCs w:val="24"/>
                 <w:lang w:val="en-US" w:eastAsia="en-US" w:bidi="ar-SA"/>
               </w:rPr>
+              <w:t>(Phase 5 gate also closes this week)</w:t>
+            </w:r>
+          </w:p>
+        </w:tc>
+        <w:tc>
+          <w:tcPr>
+            <w:tcW w:w="2352" w:type="dxa"/>
+            <w:tcBorders/>
+          </w:tcPr>
+          <w:p>
+            <w:pPr>
+              <w:pStyle w:val="Compact"/>
+              <w:widowControl/>
+              <w:spacing w:before="36" w:after="36"/>
+              <w:jc w:val="left"/>
+              <w:rPr>
+                <w:rFonts w:ascii="Cambria" w:hAnsi="Cambria" w:eastAsia="Cambria" w:cs=""/>
+                <w:kern w:val="0"/>
+                <w:szCs w:val="24"/>
+                <w:lang w:val="en-US" w:eastAsia="en-US" w:bidi="ar-SA"/>
+              </w:rPr>
+            </w:pPr>
+            <w:r>
+              <w:rPr>
+                <w:rFonts w:eastAsia="Cambria" w:cs=""/>
+                <w:kern w:val="0"/>
+                <w:sz w:val="19"/>
+                <w:szCs w:val="24"/>
+                <w:lang w:val="en-US" w:eastAsia="en-US" w:bidi="ar-SA"/>
+              </w:rPr>
               <w:t>—</w:t>
-            </w:r>
-          </w:p>
-        </w:tc>
-        <w:tc>
-          <w:tcPr>
-            <w:tcW w:w="2352" w:type="dxa"/>
-            <w:tcBorders/>
-          </w:tcPr>
-          <w:p>
-            <w:pPr>
-              <w:pStyle w:val="Compact"/>
-              <w:widowControl/>
-              <w:spacing w:before="36" w:after="36"/>
-              <w:jc w:val="left"/>
-              <w:rPr>
-                <w:rFonts w:ascii="Cambria" w:hAnsi="Cambria" w:eastAsia="Cambria" w:cs=""/>
-                <w:kern w:val="0"/>
-                <w:szCs w:val="24"/>
-                <w:lang w:val="en-US" w:eastAsia="en-US" w:bidi="ar-SA"/>
-              </w:rPr>
-            </w:pPr>
-            <w:r>
-              <w:rPr>
-                <w:rFonts w:eastAsia="Cambria" w:cs=""/>
-                <w:kern w:val="0"/>
-                <w:sz w:val="19"/>
-                <w:szCs w:val="24"/>
-                <w:lang w:val="en-US" w:eastAsia="en-US" w:bidi="ar-SA"/>
-              </w:rPr>
-              <w:t>Reconciliation time vs. baseline</w:t>
             </w:r>
           </w:p>
         </w:tc>
@@ -15127,7 +15127,7 @@
                 <w:szCs w:val="24"/>
                 <w:lang w:val="en-US" w:eastAsia="en-US" w:bidi="ar-SA"/>
               </w:rPr>
-              <w:t>Week 36</w:t>
+              <w:t>Week 33</w:t>
             </w:r>
           </w:p>
         </w:tc>
@@ -15157,7 +15157,7 @@
                 <w:szCs w:val="24"/>
                 <w:lang w:val="en-US" w:eastAsia="en-US" w:bidi="ar-SA"/>
               </w:rPr>
-              <w:t>Continue monitoring; confirm the accuracy safeguard has not introduced a new bottleneck.</w:t>
+              <w:t>Continue monitoring; no new resistance entries logged across any sub-team.</w:t>
             </w:r>
           </w:p>
         </w:tc>
@@ -15217,7 +15217,7 @@
                 <w:szCs w:val="24"/>
                 <w:lang w:val="en-US" w:eastAsia="en-US" w:bidi="ar-SA"/>
               </w:rPr>
-              <w:t>M21 — routine log.</w:t>
+              <w:t>M10 (Resistance) — 0 open entries.</w:t>
             </w:r>
           </w:p>
         </w:tc>
@@ -15314,7 +15314,7 @@
                 <w:szCs w:val="24"/>
                 <w:lang w:val="en-US" w:eastAsia="en-US" w:bidi="ar-SA"/>
               </w:rPr>
-              <w:t>Week 38</w:t>
+              <w:t>Week 34</w:t>
             </w:r>
           </w:p>
         </w:tc>
@@ -15344,7 +15344,7 @@
                 <w:szCs w:val="24"/>
                 <w:lang w:val="en-US" w:eastAsia="en-US" w:bidi="ar-SA"/>
               </w:rPr>
-              <w:t>Continue monitoring; confirm the accuracy safeguard is being used correctly, not skipped.</w:t>
+              <w:t>Monitor reconciliation cycle time against the pre-redesign baseline.</w:t>
             </w:r>
           </w:p>
         </w:tc>
@@ -15404,7 +15404,7 @@
                 <w:szCs w:val="24"/>
                 <w:lang w:val="en-US" w:eastAsia="en-US" w:bidi="ar-SA"/>
               </w:rPr>
-              <w:t>M21 — routine log.</w:t>
+              <w:t>M14 (Analytics) — first post-rollout reconciliation-time reading.</w:t>
             </w:r>
           </w:p>
         </w:tc>
@@ -15464,7 +15464,7 @@
                 <w:szCs w:val="24"/>
                 <w:lang w:val="en-US" w:eastAsia="en-US" w:bidi="ar-SA"/>
               </w:rPr>
-              <w:t>—</w:t>
+              <w:t>Reconciliation time vs. baseline</w:t>
             </w:r>
           </w:p>
         </w:tc>
@@ -15501,6 +15501,941 @@
                 <w:szCs w:val="24"/>
                 <w:lang w:val="en-US" w:eastAsia="en-US" w:bidi="ar-SA"/>
               </w:rPr>
+              <w:t>Week 35</w:t>
+            </w:r>
+          </w:p>
+        </w:tc>
+        <w:tc>
+          <w:tcPr>
+            <w:tcW w:w="2351" w:type="dxa"/>
+            <w:tcBorders/>
+          </w:tcPr>
+          <w:p>
+            <w:pPr>
+              <w:pStyle w:val="Compact"/>
+              <w:widowControl/>
+              <w:spacing w:before="36" w:after="36"/>
+              <w:jc w:val="left"/>
+              <w:rPr>
+                <w:rFonts w:ascii="Cambria" w:hAnsi="Cambria" w:eastAsia="Cambria" w:cs=""/>
+                <w:kern w:val="0"/>
+                <w:szCs w:val="24"/>
+                <w:lang w:val="en-US" w:eastAsia="en-US" w:bidi="ar-SA"/>
+              </w:rPr>
+            </w:pPr>
+            <w:r>
+              <w:rPr>
+                <w:rFonts w:eastAsia="Cambria" w:cs=""/>
+                <w:kern w:val="0"/>
+                <w:sz w:val="19"/>
+                <w:szCs w:val="24"/>
+                <w:lang w:val="en-US" w:eastAsia="en-US" w:bidi="ar-SA"/>
+              </w:rPr>
+              <w:t>Continue monitoring.</w:t>
+            </w:r>
+          </w:p>
+        </w:tc>
+        <w:tc>
+          <w:tcPr>
+            <w:tcW w:w="2352" w:type="dxa"/>
+            <w:tcBorders/>
+          </w:tcPr>
+          <w:p>
+            <w:pPr>
+              <w:pStyle w:val="Compact"/>
+              <w:widowControl/>
+              <w:spacing w:before="36" w:after="36"/>
+              <w:jc w:val="left"/>
+              <w:rPr>
+                <w:rFonts w:ascii="Cambria" w:hAnsi="Cambria" w:eastAsia="Cambria" w:cs=""/>
+                <w:kern w:val="0"/>
+                <w:szCs w:val="24"/>
+                <w:lang w:val="en-US" w:eastAsia="en-US" w:bidi="ar-SA"/>
+              </w:rPr>
+            </w:pPr>
+            <w:r>
+              <w:rPr>
+                <w:rFonts w:eastAsia="Cambria" w:cs=""/>
+                <w:kern w:val="0"/>
+                <w:sz w:val="19"/>
+                <w:szCs w:val="24"/>
+                <w:lang w:val="en-US" w:eastAsia="en-US" w:bidi="ar-SA"/>
+              </w:rPr>
+              <w:t>—</w:t>
+            </w:r>
+          </w:p>
+        </w:tc>
+        <w:tc>
+          <w:tcPr>
+            <w:tcW w:w="2353" w:type="dxa"/>
+            <w:tcBorders/>
+          </w:tcPr>
+          <w:p>
+            <w:pPr>
+              <w:pStyle w:val="Compact"/>
+              <w:widowControl/>
+              <w:spacing w:before="36" w:after="36"/>
+              <w:jc w:val="left"/>
+              <w:rPr>
+                <w:rFonts w:ascii="Cambria" w:hAnsi="Cambria" w:eastAsia="Cambria" w:cs=""/>
+                <w:kern w:val="0"/>
+                <w:szCs w:val="24"/>
+                <w:lang w:val="en-US" w:eastAsia="en-US" w:bidi="ar-SA"/>
+              </w:rPr>
+            </w:pPr>
+            <w:r>
+              <w:rPr>
+                <w:rFonts w:eastAsia="Cambria" w:cs=""/>
+                <w:kern w:val="0"/>
+                <w:sz w:val="19"/>
+                <w:szCs w:val="24"/>
+                <w:lang w:val="en-US" w:eastAsia="en-US" w:bidi="ar-SA"/>
+              </w:rPr>
+              <w:t>M21 — routine log.</w:t>
+            </w:r>
+          </w:p>
+        </w:tc>
+        <w:tc>
+          <w:tcPr>
+            <w:tcW w:w="2351" w:type="dxa"/>
+            <w:tcBorders/>
+          </w:tcPr>
+          <w:p>
+            <w:pPr>
+              <w:pStyle w:val="Compact"/>
+              <w:widowControl/>
+              <w:spacing w:before="36" w:after="36"/>
+              <w:jc w:val="left"/>
+              <w:rPr>
+                <w:rFonts w:ascii="Cambria" w:hAnsi="Cambria" w:eastAsia="Cambria" w:cs=""/>
+                <w:kern w:val="0"/>
+                <w:szCs w:val="24"/>
+                <w:lang w:val="en-US" w:eastAsia="en-US" w:bidi="ar-SA"/>
+              </w:rPr>
+            </w:pPr>
+            <w:r>
+              <w:rPr>
+                <w:rFonts w:eastAsia="Cambria" w:cs=""/>
+                <w:kern w:val="0"/>
+                <w:sz w:val="19"/>
+                <w:szCs w:val="24"/>
+                <w:lang w:val="en-US" w:eastAsia="en-US" w:bidi="ar-SA"/>
+              </w:rPr>
+              <w:t>—</w:t>
+            </w:r>
+          </w:p>
+        </w:tc>
+        <w:tc>
+          <w:tcPr>
+            <w:tcW w:w="2352" w:type="dxa"/>
+            <w:tcBorders/>
+          </w:tcPr>
+          <w:p>
+            <w:pPr>
+              <w:pStyle w:val="Compact"/>
+              <w:widowControl/>
+              <w:spacing w:before="36" w:after="36"/>
+              <w:jc w:val="left"/>
+              <w:rPr>
+                <w:rFonts w:ascii="Cambria" w:hAnsi="Cambria" w:eastAsia="Cambria" w:cs=""/>
+                <w:kern w:val="0"/>
+                <w:szCs w:val="24"/>
+                <w:lang w:val="en-US" w:eastAsia="en-US" w:bidi="ar-SA"/>
+              </w:rPr>
+            </w:pPr>
+            <w:r>
+              <w:rPr>
+                <w:rFonts w:eastAsia="Cambria" w:cs=""/>
+                <w:kern w:val="0"/>
+                <w:sz w:val="19"/>
+                <w:szCs w:val="24"/>
+                <w:lang w:val="en-US" w:eastAsia="en-US" w:bidi="ar-SA"/>
+              </w:rPr>
+              <w:t>—</w:t>
+            </w:r>
+          </w:p>
+        </w:tc>
+      </w:tr>
+      <w:tr>
+        <w:trPr>
+          <w:cantSplit w:val="true"/>
+        </w:trPr>
+        <w:tc>
+          <w:tcPr>
+            <w:tcW w:w="2352" w:type="dxa"/>
+            <w:tcBorders/>
+          </w:tcPr>
+          <w:p>
+            <w:pPr>
+              <w:pStyle w:val="Compact"/>
+              <w:widowControl/>
+              <w:spacing w:before="36" w:after="36"/>
+              <w:jc w:val="left"/>
+              <w:rPr>
+                <w:rFonts w:ascii="Cambria" w:hAnsi="Cambria" w:eastAsia="Cambria" w:cs=""/>
+                <w:kern w:val="0"/>
+                <w:szCs w:val="24"/>
+                <w:lang w:val="en-US" w:eastAsia="en-US" w:bidi="ar-SA"/>
+              </w:rPr>
+            </w:pPr>
+            <w:r>
+              <w:rPr>
+                <w:rFonts w:eastAsia="Cambria" w:cs=""/>
+                <w:b/>
+                <w:bCs/>
+                <w:kern w:val="0"/>
+                <w:sz w:val="19"/>
+                <w:szCs w:val="24"/>
+                <w:lang w:val="en-US" w:eastAsia="en-US" w:bidi="ar-SA"/>
+              </w:rPr>
+              <w:t>Week 36</w:t>
+            </w:r>
+          </w:p>
+        </w:tc>
+        <w:tc>
+          <w:tcPr>
+            <w:tcW w:w="2351" w:type="dxa"/>
+            <w:tcBorders/>
+          </w:tcPr>
+          <w:p>
+            <w:pPr>
+              <w:pStyle w:val="Compact"/>
+              <w:widowControl/>
+              <w:spacing w:before="36" w:after="36"/>
+              <w:jc w:val="left"/>
+              <w:rPr>
+                <w:rFonts w:ascii="Cambria" w:hAnsi="Cambria" w:eastAsia="Cambria" w:cs=""/>
+                <w:kern w:val="0"/>
+                <w:szCs w:val="24"/>
+                <w:lang w:val="en-US" w:eastAsia="en-US" w:bidi="ar-SA"/>
+              </w:rPr>
+            </w:pPr>
+            <w:r>
+              <w:rPr>
+                <w:rFonts w:eastAsia="Cambria" w:cs=""/>
+                <w:kern w:val="0"/>
+                <w:sz w:val="19"/>
+                <w:szCs w:val="24"/>
+                <w:lang w:val="en-US" w:eastAsia="en-US" w:bidi="ar-SA"/>
+              </w:rPr>
+              <w:t>Continue monitoring; confirm the accuracy safeguard has not introduced a new bottleneck.</w:t>
+            </w:r>
+          </w:p>
+        </w:tc>
+        <w:tc>
+          <w:tcPr>
+            <w:tcW w:w="2352" w:type="dxa"/>
+            <w:tcBorders/>
+          </w:tcPr>
+          <w:p>
+            <w:pPr>
+              <w:pStyle w:val="Compact"/>
+              <w:widowControl/>
+              <w:spacing w:before="36" w:after="36"/>
+              <w:jc w:val="left"/>
+              <w:rPr>
+                <w:rFonts w:ascii="Cambria" w:hAnsi="Cambria" w:eastAsia="Cambria" w:cs=""/>
+                <w:kern w:val="0"/>
+                <w:szCs w:val="24"/>
+                <w:lang w:val="en-US" w:eastAsia="en-US" w:bidi="ar-SA"/>
+              </w:rPr>
+            </w:pPr>
+            <w:r>
+              <w:rPr>
+                <w:rFonts w:eastAsia="Cambria" w:cs=""/>
+                <w:kern w:val="0"/>
+                <w:sz w:val="19"/>
+                <w:szCs w:val="24"/>
+                <w:lang w:val="en-US" w:eastAsia="en-US" w:bidi="ar-SA"/>
+              </w:rPr>
+              <w:t>—</w:t>
+            </w:r>
+          </w:p>
+        </w:tc>
+        <w:tc>
+          <w:tcPr>
+            <w:tcW w:w="2353" w:type="dxa"/>
+            <w:tcBorders/>
+          </w:tcPr>
+          <w:p>
+            <w:pPr>
+              <w:pStyle w:val="Compact"/>
+              <w:widowControl/>
+              <w:spacing w:before="36" w:after="36"/>
+              <w:jc w:val="left"/>
+              <w:rPr>
+                <w:rFonts w:ascii="Cambria" w:hAnsi="Cambria" w:eastAsia="Cambria" w:cs=""/>
+                <w:kern w:val="0"/>
+                <w:szCs w:val="24"/>
+                <w:lang w:val="en-US" w:eastAsia="en-US" w:bidi="ar-SA"/>
+              </w:rPr>
+            </w:pPr>
+            <w:r>
+              <w:rPr>
+                <w:rFonts w:eastAsia="Cambria" w:cs=""/>
+                <w:kern w:val="0"/>
+                <w:sz w:val="19"/>
+                <w:szCs w:val="24"/>
+                <w:lang w:val="en-US" w:eastAsia="en-US" w:bidi="ar-SA"/>
+              </w:rPr>
+              <w:t>M21 — routine log.</w:t>
+            </w:r>
+          </w:p>
+        </w:tc>
+        <w:tc>
+          <w:tcPr>
+            <w:tcW w:w="2351" w:type="dxa"/>
+            <w:tcBorders/>
+          </w:tcPr>
+          <w:p>
+            <w:pPr>
+              <w:pStyle w:val="Compact"/>
+              <w:widowControl/>
+              <w:spacing w:before="36" w:after="36"/>
+              <w:jc w:val="left"/>
+              <w:rPr>
+                <w:rFonts w:ascii="Cambria" w:hAnsi="Cambria" w:eastAsia="Cambria" w:cs=""/>
+                <w:kern w:val="0"/>
+                <w:szCs w:val="24"/>
+                <w:lang w:val="en-US" w:eastAsia="en-US" w:bidi="ar-SA"/>
+              </w:rPr>
+            </w:pPr>
+            <w:r>
+              <w:rPr>
+                <w:rFonts w:eastAsia="Cambria" w:cs=""/>
+                <w:kern w:val="0"/>
+                <w:sz w:val="19"/>
+                <w:szCs w:val="24"/>
+                <w:lang w:val="en-US" w:eastAsia="en-US" w:bidi="ar-SA"/>
+              </w:rPr>
+              <w:t>—</w:t>
+            </w:r>
+          </w:p>
+        </w:tc>
+        <w:tc>
+          <w:tcPr>
+            <w:tcW w:w="2352" w:type="dxa"/>
+            <w:tcBorders/>
+          </w:tcPr>
+          <w:p>
+            <w:pPr>
+              <w:pStyle w:val="Compact"/>
+              <w:widowControl/>
+              <w:spacing w:before="36" w:after="36"/>
+              <w:jc w:val="left"/>
+              <w:rPr>
+                <w:rFonts w:ascii="Cambria" w:hAnsi="Cambria" w:eastAsia="Cambria" w:cs=""/>
+                <w:kern w:val="0"/>
+                <w:szCs w:val="24"/>
+                <w:lang w:val="en-US" w:eastAsia="en-US" w:bidi="ar-SA"/>
+              </w:rPr>
+            </w:pPr>
+            <w:r>
+              <w:rPr>
+                <w:rFonts w:eastAsia="Cambria" w:cs=""/>
+                <w:kern w:val="0"/>
+                <w:sz w:val="19"/>
+                <w:szCs w:val="24"/>
+                <w:lang w:val="en-US" w:eastAsia="en-US" w:bidi="ar-SA"/>
+              </w:rPr>
+              <w:t>—</w:t>
+            </w:r>
+          </w:p>
+        </w:tc>
+      </w:tr>
+      <w:tr>
+        <w:trPr>
+          <w:cantSplit w:val="true"/>
+        </w:trPr>
+        <w:tc>
+          <w:tcPr>
+            <w:tcW w:w="2352" w:type="dxa"/>
+            <w:tcBorders/>
+          </w:tcPr>
+          <w:p>
+            <w:pPr>
+              <w:pStyle w:val="Compact"/>
+              <w:widowControl/>
+              <w:spacing w:before="36" w:after="36"/>
+              <w:jc w:val="left"/>
+              <w:rPr>
+                <w:rFonts w:ascii="Cambria" w:hAnsi="Cambria" w:eastAsia="Cambria" w:cs=""/>
+                <w:kern w:val="0"/>
+                <w:szCs w:val="24"/>
+                <w:lang w:val="en-US" w:eastAsia="en-US" w:bidi="ar-SA"/>
+              </w:rPr>
+            </w:pPr>
+            <w:r>
+              <w:rPr>
+                <w:rFonts w:eastAsia="Cambria" w:cs=""/>
+                <w:b/>
+                <w:bCs/>
+                <w:kern w:val="0"/>
+                <w:sz w:val="19"/>
+                <w:szCs w:val="24"/>
+                <w:lang w:val="en-US" w:eastAsia="en-US" w:bidi="ar-SA"/>
+              </w:rPr>
+              <w:t>Week 37</w:t>
+            </w:r>
+          </w:p>
+        </w:tc>
+        <w:tc>
+          <w:tcPr>
+            <w:tcW w:w="2351" w:type="dxa"/>
+            <w:tcBorders/>
+          </w:tcPr>
+          <w:p>
+            <w:pPr>
+              <w:pStyle w:val="Compact"/>
+              <w:widowControl/>
+              <w:spacing w:before="36" w:after="36"/>
+              <w:jc w:val="left"/>
+              <w:rPr>
+                <w:rFonts w:ascii="Cambria" w:hAnsi="Cambria" w:eastAsia="Cambria" w:cs=""/>
+                <w:kern w:val="0"/>
+                <w:szCs w:val="24"/>
+                <w:lang w:val="en-US" w:eastAsia="en-US" w:bidi="ar-SA"/>
+              </w:rPr>
+            </w:pPr>
+            <w:r>
+              <w:rPr>
+                <w:rFonts w:eastAsia="Cambria" w:cs=""/>
+                <w:kern w:val="0"/>
+                <w:sz w:val="19"/>
+                <w:szCs w:val="24"/>
+                <w:lang w:val="en-US" w:eastAsia="en-US" w:bidi="ar-SA"/>
+              </w:rPr>
+              <w:t>Continue monitoring.</w:t>
+            </w:r>
+          </w:p>
+        </w:tc>
+        <w:tc>
+          <w:tcPr>
+            <w:tcW w:w="2352" w:type="dxa"/>
+            <w:tcBorders/>
+          </w:tcPr>
+          <w:p>
+            <w:pPr>
+              <w:pStyle w:val="Compact"/>
+              <w:widowControl/>
+              <w:spacing w:before="36" w:after="36"/>
+              <w:jc w:val="left"/>
+              <w:rPr>
+                <w:rFonts w:ascii="Cambria" w:hAnsi="Cambria" w:eastAsia="Cambria" w:cs=""/>
+                <w:kern w:val="0"/>
+                <w:szCs w:val="24"/>
+                <w:lang w:val="en-US" w:eastAsia="en-US" w:bidi="ar-SA"/>
+              </w:rPr>
+            </w:pPr>
+            <w:r>
+              <w:rPr>
+                <w:rFonts w:eastAsia="Cambria" w:cs=""/>
+                <w:kern w:val="0"/>
+                <w:sz w:val="19"/>
+                <w:szCs w:val="24"/>
+                <w:lang w:val="en-US" w:eastAsia="en-US" w:bidi="ar-SA"/>
+              </w:rPr>
+              <w:t>—</w:t>
+            </w:r>
+          </w:p>
+        </w:tc>
+        <w:tc>
+          <w:tcPr>
+            <w:tcW w:w="2353" w:type="dxa"/>
+            <w:tcBorders/>
+          </w:tcPr>
+          <w:p>
+            <w:pPr>
+              <w:pStyle w:val="Compact"/>
+              <w:widowControl/>
+              <w:spacing w:before="36" w:after="36"/>
+              <w:jc w:val="left"/>
+              <w:rPr>
+                <w:rFonts w:ascii="Cambria" w:hAnsi="Cambria" w:eastAsia="Cambria" w:cs=""/>
+                <w:kern w:val="0"/>
+                <w:szCs w:val="24"/>
+                <w:lang w:val="en-US" w:eastAsia="en-US" w:bidi="ar-SA"/>
+              </w:rPr>
+            </w:pPr>
+            <w:r>
+              <w:rPr>
+                <w:rFonts w:eastAsia="Cambria" w:cs=""/>
+                <w:kern w:val="0"/>
+                <w:sz w:val="19"/>
+                <w:szCs w:val="24"/>
+                <w:lang w:val="en-US" w:eastAsia="en-US" w:bidi="ar-SA"/>
+              </w:rPr>
+              <w:t>M21 — routine log.</w:t>
+            </w:r>
+          </w:p>
+        </w:tc>
+        <w:tc>
+          <w:tcPr>
+            <w:tcW w:w="2351" w:type="dxa"/>
+            <w:tcBorders/>
+          </w:tcPr>
+          <w:p>
+            <w:pPr>
+              <w:pStyle w:val="Compact"/>
+              <w:widowControl/>
+              <w:spacing w:before="36" w:after="36"/>
+              <w:jc w:val="left"/>
+              <w:rPr>
+                <w:rFonts w:ascii="Cambria" w:hAnsi="Cambria" w:eastAsia="Cambria" w:cs=""/>
+                <w:kern w:val="0"/>
+                <w:szCs w:val="24"/>
+                <w:lang w:val="en-US" w:eastAsia="en-US" w:bidi="ar-SA"/>
+              </w:rPr>
+            </w:pPr>
+            <w:r>
+              <w:rPr>
+                <w:rFonts w:eastAsia="Cambria" w:cs=""/>
+                <w:kern w:val="0"/>
+                <w:sz w:val="19"/>
+                <w:szCs w:val="24"/>
+                <w:lang w:val="en-US" w:eastAsia="en-US" w:bidi="ar-SA"/>
+              </w:rPr>
+              <w:t>—</w:t>
+            </w:r>
+          </w:p>
+        </w:tc>
+        <w:tc>
+          <w:tcPr>
+            <w:tcW w:w="2352" w:type="dxa"/>
+            <w:tcBorders/>
+          </w:tcPr>
+          <w:p>
+            <w:pPr>
+              <w:pStyle w:val="Compact"/>
+              <w:widowControl/>
+              <w:spacing w:before="36" w:after="36"/>
+              <w:jc w:val="left"/>
+              <w:rPr>
+                <w:rFonts w:ascii="Cambria" w:hAnsi="Cambria" w:eastAsia="Cambria" w:cs=""/>
+                <w:kern w:val="0"/>
+                <w:szCs w:val="24"/>
+                <w:lang w:val="en-US" w:eastAsia="en-US" w:bidi="ar-SA"/>
+              </w:rPr>
+            </w:pPr>
+            <w:r>
+              <w:rPr>
+                <w:rFonts w:eastAsia="Cambria" w:cs=""/>
+                <w:kern w:val="0"/>
+                <w:sz w:val="19"/>
+                <w:szCs w:val="24"/>
+                <w:lang w:val="en-US" w:eastAsia="en-US" w:bidi="ar-SA"/>
+              </w:rPr>
+              <w:t>—</w:t>
+            </w:r>
+          </w:p>
+        </w:tc>
+      </w:tr>
+      <w:tr>
+        <w:trPr>
+          <w:cantSplit w:val="true"/>
+        </w:trPr>
+        <w:tc>
+          <w:tcPr>
+            <w:tcW w:w="2352" w:type="dxa"/>
+            <w:tcBorders/>
+          </w:tcPr>
+          <w:p>
+            <w:pPr>
+              <w:pStyle w:val="Compact"/>
+              <w:widowControl/>
+              <w:spacing w:before="36" w:after="36"/>
+              <w:jc w:val="left"/>
+              <w:rPr>
+                <w:rFonts w:ascii="Cambria" w:hAnsi="Cambria" w:eastAsia="Cambria" w:cs=""/>
+                <w:kern w:val="0"/>
+                <w:szCs w:val="24"/>
+                <w:lang w:val="en-US" w:eastAsia="en-US" w:bidi="ar-SA"/>
+              </w:rPr>
+            </w:pPr>
+            <w:r>
+              <w:rPr>
+                <w:rFonts w:eastAsia="Cambria" w:cs=""/>
+                <w:b/>
+                <w:bCs/>
+                <w:kern w:val="0"/>
+                <w:sz w:val="19"/>
+                <w:szCs w:val="24"/>
+                <w:lang w:val="en-US" w:eastAsia="en-US" w:bidi="ar-SA"/>
+              </w:rPr>
+              <w:t>Week 38</w:t>
+            </w:r>
+          </w:p>
+        </w:tc>
+        <w:tc>
+          <w:tcPr>
+            <w:tcW w:w="2351" w:type="dxa"/>
+            <w:tcBorders/>
+          </w:tcPr>
+          <w:p>
+            <w:pPr>
+              <w:pStyle w:val="Compact"/>
+              <w:widowControl/>
+              <w:spacing w:before="36" w:after="36"/>
+              <w:jc w:val="left"/>
+              <w:rPr>
+                <w:rFonts w:ascii="Cambria" w:hAnsi="Cambria" w:eastAsia="Cambria" w:cs=""/>
+                <w:kern w:val="0"/>
+                <w:szCs w:val="24"/>
+                <w:lang w:val="en-US" w:eastAsia="en-US" w:bidi="ar-SA"/>
+              </w:rPr>
+            </w:pPr>
+            <w:r>
+              <w:rPr>
+                <w:rFonts w:eastAsia="Cambria" w:cs=""/>
+                <w:kern w:val="0"/>
+                <w:sz w:val="19"/>
+                <w:szCs w:val="24"/>
+                <w:lang w:val="en-US" w:eastAsia="en-US" w:bidi="ar-SA"/>
+              </w:rPr>
+              <w:t>Continue monitoring; confirm the accuracy safeguard is being used correctly, not skipped.</w:t>
+            </w:r>
+          </w:p>
+        </w:tc>
+        <w:tc>
+          <w:tcPr>
+            <w:tcW w:w="2352" w:type="dxa"/>
+            <w:tcBorders/>
+          </w:tcPr>
+          <w:p>
+            <w:pPr>
+              <w:pStyle w:val="Compact"/>
+              <w:widowControl/>
+              <w:spacing w:before="36" w:after="36"/>
+              <w:jc w:val="left"/>
+              <w:rPr>
+                <w:rFonts w:ascii="Cambria" w:hAnsi="Cambria" w:eastAsia="Cambria" w:cs=""/>
+                <w:kern w:val="0"/>
+                <w:szCs w:val="24"/>
+                <w:lang w:val="en-US" w:eastAsia="en-US" w:bidi="ar-SA"/>
+              </w:rPr>
+            </w:pPr>
+            <w:r>
+              <w:rPr>
+                <w:rFonts w:eastAsia="Cambria" w:cs=""/>
+                <w:kern w:val="0"/>
+                <w:sz w:val="19"/>
+                <w:szCs w:val="24"/>
+                <w:lang w:val="en-US" w:eastAsia="en-US" w:bidi="ar-SA"/>
+              </w:rPr>
+              <w:t>—</w:t>
+            </w:r>
+          </w:p>
+        </w:tc>
+        <w:tc>
+          <w:tcPr>
+            <w:tcW w:w="2353" w:type="dxa"/>
+            <w:tcBorders/>
+          </w:tcPr>
+          <w:p>
+            <w:pPr>
+              <w:pStyle w:val="Compact"/>
+              <w:widowControl/>
+              <w:spacing w:before="36" w:after="36"/>
+              <w:jc w:val="left"/>
+              <w:rPr>
+                <w:rFonts w:ascii="Cambria" w:hAnsi="Cambria" w:eastAsia="Cambria" w:cs=""/>
+                <w:kern w:val="0"/>
+                <w:szCs w:val="24"/>
+                <w:lang w:val="en-US" w:eastAsia="en-US" w:bidi="ar-SA"/>
+              </w:rPr>
+            </w:pPr>
+            <w:r>
+              <w:rPr>
+                <w:rFonts w:eastAsia="Cambria" w:cs=""/>
+                <w:kern w:val="0"/>
+                <w:sz w:val="19"/>
+                <w:szCs w:val="24"/>
+                <w:lang w:val="en-US" w:eastAsia="en-US" w:bidi="ar-SA"/>
+              </w:rPr>
+              <w:t>M21 — routine log.</w:t>
+            </w:r>
+          </w:p>
+        </w:tc>
+        <w:tc>
+          <w:tcPr>
+            <w:tcW w:w="2351" w:type="dxa"/>
+            <w:tcBorders/>
+          </w:tcPr>
+          <w:p>
+            <w:pPr>
+              <w:pStyle w:val="Compact"/>
+              <w:widowControl/>
+              <w:spacing w:before="36" w:after="36"/>
+              <w:jc w:val="left"/>
+              <w:rPr>
+                <w:rFonts w:ascii="Cambria" w:hAnsi="Cambria" w:eastAsia="Cambria" w:cs=""/>
+                <w:kern w:val="0"/>
+                <w:szCs w:val="24"/>
+                <w:lang w:val="en-US" w:eastAsia="en-US" w:bidi="ar-SA"/>
+              </w:rPr>
+            </w:pPr>
+            <w:r>
+              <w:rPr>
+                <w:rFonts w:eastAsia="Cambria" w:cs=""/>
+                <w:kern w:val="0"/>
+                <w:sz w:val="19"/>
+                <w:szCs w:val="24"/>
+                <w:lang w:val="en-US" w:eastAsia="en-US" w:bidi="ar-SA"/>
+              </w:rPr>
+              <w:t>—</w:t>
+            </w:r>
+          </w:p>
+        </w:tc>
+        <w:tc>
+          <w:tcPr>
+            <w:tcW w:w="2352" w:type="dxa"/>
+            <w:tcBorders/>
+          </w:tcPr>
+          <w:p>
+            <w:pPr>
+              <w:pStyle w:val="Compact"/>
+              <w:widowControl/>
+              <w:spacing w:before="36" w:after="36"/>
+              <w:jc w:val="left"/>
+              <w:rPr>
+                <w:rFonts w:ascii="Cambria" w:hAnsi="Cambria" w:eastAsia="Cambria" w:cs=""/>
+                <w:kern w:val="0"/>
+                <w:szCs w:val="24"/>
+                <w:lang w:val="en-US" w:eastAsia="en-US" w:bidi="ar-SA"/>
+              </w:rPr>
+            </w:pPr>
+            <w:r>
+              <w:rPr>
+                <w:rFonts w:eastAsia="Cambria" w:cs=""/>
+                <w:kern w:val="0"/>
+                <w:sz w:val="19"/>
+                <w:szCs w:val="24"/>
+                <w:lang w:val="en-US" w:eastAsia="en-US" w:bidi="ar-SA"/>
+              </w:rPr>
+              <w:t>—</w:t>
+            </w:r>
+          </w:p>
+        </w:tc>
+      </w:tr>
+      <w:tr>
+        <w:trPr>
+          <w:cantSplit w:val="true"/>
+        </w:trPr>
+        <w:tc>
+          <w:tcPr>
+            <w:tcW w:w="2352" w:type="dxa"/>
+            <w:tcBorders/>
+          </w:tcPr>
+          <w:p>
+            <w:pPr>
+              <w:pStyle w:val="Compact"/>
+              <w:widowControl/>
+              <w:spacing w:before="36" w:after="36"/>
+              <w:jc w:val="left"/>
+              <w:rPr>
+                <w:rFonts w:ascii="Cambria" w:hAnsi="Cambria" w:eastAsia="Cambria" w:cs=""/>
+                <w:kern w:val="0"/>
+                <w:szCs w:val="24"/>
+                <w:lang w:val="en-US" w:eastAsia="en-US" w:bidi="ar-SA"/>
+              </w:rPr>
+            </w:pPr>
+            <w:r>
+              <w:rPr>
+                <w:rFonts w:eastAsia="Cambria" w:cs=""/>
+                <w:b/>
+                <w:bCs/>
+                <w:kern w:val="0"/>
+                <w:sz w:val="19"/>
+                <w:szCs w:val="24"/>
+                <w:lang w:val="en-US" w:eastAsia="en-US" w:bidi="ar-SA"/>
+              </w:rPr>
+              <w:t>Week 39</w:t>
+            </w:r>
+          </w:p>
+        </w:tc>
+        <w:tc>
+          <w:tcPr>
+            <w:tcW w:w="2351" w:type="dxa"/>
+            <w:tcBorders/>
+          </w:tcPr>
+          <w:p>
+            <w:pPr>
+              <w:pStyle w:val="Compact"/>
+              <w:widowControl/>
+              <w:spacing w:before="36" w:after="36"/>
+              <w:jc w:val="left"/>
+              <w:rPr>
+                <w:rFonts w:ascii="Cambria" w:hAnsi="Cambria" w:eastAsia="Cambria" w:cs=""/>
+                <w:kern w:val="0"/>
+                <w:szCs w:val="24"/>
+                <w:lang w:val="en-US" w:eastAsia="en-US" w:bidi="ar-SA"/>
+              </w:rPr>
+            </w:pPr>
+            <w:r>
+              <w:rPr>
+                <w:rFonts w:eastAsia="Cambria" w:cs=""/>
+                <w:kern w:val="0"/>
+                <w:sz w:val="19"/>
+                <w:szCs w:val="24"/>
+                <w:lang w:val="en-US" w:eastAsia="en-US" w:bidi="ar-SA"/>
+              </w:rPr>
+              <w:t>Continue monitoring.</w:t>
+            </w:r>
+          </w:p>
+        </w:tc>
+        <w:tc>
+          <w:tcPr>
+            <w:tcW w:w="2352" w:type="dxa"/>
+            <w:tcBorders/>
+          </w:tcPr>
+          <w:p>
+            <w:pPr>
+              <w:pStyle w:val="Compact"/>
+              <w:widowControl/>
+              <w:spacing w:before="36" w:after="36"/>
+              <w:jc w:val="left"/>
+              <w:rPr>
+                <w:rFonts w:ascii="Cambria" w:hAnsi="Cambria" w:eastAsia="Cambria" w:cs=""/>
+                <w:kern w:val="0"/>
+                <w:szCs w:val="24"/>
+                <w:lang w:val="en-US" w:eastAsia="en-US" w:bidi="ar-SA"/>
+              </w:rPr>
+            </w:pPr>
+            <w:r>
+              <w:rPr>
+                <w:rFonts w:eastAsia="Cambria" w:cs=""/>
+                <w:kern w:val="0"/>
+                <w:sz w:val="19"/>
+                <w:szCs w:val="24"/>
+                <w:lang w:val="en-US" w:eastAsia="en-US" w:bidi="ar-SA"/>
+              </w:rPr>
+              <w:t>—</w:t>
+            </w:r>
+          </w:p>
+        </w:tc>
+        <w:tc>
+          <w:tcPr>
+            <w:tcW w:w="2353" w:type="dxa"/>
+            <w:tcBorders/>
+          </w:tcPr>
+          <w:p>
+            <w:pPr>
+              <w:pStyle w:val="Compact"/>
+              <w:widowControl/>
+              <w:spacing w:before="36" w:after="36"/>
+              <w:jc w:val="left"/>
+              <w:rPr>
+                <w:rFonts w:ascii="Cambria" w:hAnsi="Cambria" w:eastAsia="Cambria" w:cs=""/>
+                <w:kern w:val="0"/>
+                <w:szCs w:val="24"/>
+                <w:lang w:val="en-US" w:eastAsia="en-US" w:bidi="ar-SA"/>
+              </w:rPr>
+            </w:pPr>
+            <w:r>
+              <w:rPr>
+                <w:rFonts w:eastAsia="Cambria" w:cs=""/>
+                <w:kern w:val="0"/>
+                <w:sz w:val="19"/>
+                <w:szCs w:val="24"/>
+                <w:lang w:val="en-US" w:eastAsia="en-US" w:bidi="ar-SA"/>
+              </w:rPr>
+              <w:t>M21 — routine log.</w:t>
+            </w:r>
+          </w:p>
+        </w:tc>
+        <w:tc>
+          <w:tcPr>
+            <w:tcW w:w="2351" w:type="dxa"/>
+            <w:tcBorders/>
+          </w:tcPr>
+          <w:p>
+            <w:pPr>
+              <w:pStyle w:val="Compact"/>
+              <w:widowControl/>
+              <w:spacing w:before="36" w:after="36"/>
+              <w:jc w:val="left"/>
+              <w:rPr>
+                <w:rFonts w:ascii="Cambria" w:hAnsi="Cambria" w:eastAsia="Cambria" w:cs=""/>
+                <w:kern w:val="0"/>
+                <w:szCs w:val="24"/>
+                <w:lang w:val="en-US" w:eastAsia="en-US" w:bidi="ar-SA"/>
+              </w:rPr>
+            </w:pPr>
+            <w:r>
+              <w:rPr>
+                <w:rFonts w:eastAsia="Cambria" w:cs=""/>
+                <w:kern w:val="0"/>
+                <w:sz w:val="19"/>
+                <w:szCs w:val="24"/>
+                <w:lang w:val="en-US" w:eastAsia="en-US" w:bidi="ar-SA"/>
+              </w:rPr>
+              <w:t>—</w:t>
+            </w:r>
+          </w:p>
+        </w:tc>
+        <w:tc>
+          <w:tcPr>
+            <w:tcW w:w="2352" w:type="dxa"/>
+            <w:tcBorders/>
+          </w:tcPr>
+          <w:p>
+            <w:pPr>
+              <w:pStyle w:val="Compact"/>
+              <w:widowControl/>
+              <w:spacing w:before="36" w:after="36"/>
+              <w:jc w:val="left"/>
+              <w:rPr>
+                <w:rFonts w:ascii="Cambria" w:hAnsi="Cambria" w:eastAsia="Cambria" w:cs=""/>
+                <w:kern w:val="0"/>
+                <w:szCs w:val="24"/>
+                <w:lang w:val="en-US" w:eastAsia="en-US" w:bidi="ar-SA"/>
+              </w:rPr>
+            </w:pPr>
+            <w:r>
+              <w:rPr>
+                <w:rFonts w:eastAsia="Cambria" w:cs=""/>
+                <w:kern w:val="0"/>
+                <w:sz w:val="19"/>
+                <w:szCs w:val="24"/>
+                <w:lang w:val="en-US" w:eastAsia="en-US" w:bidi="ar-SA"/>
+              </w:rPr>
+              <w:t>—</w:t>
+            </w:r>
+          </w:p>
+        </w:tc>
+      </w:tr>
+      <w:tr>
+        <w:trPr>
+          <w:cantSplit w:val="true"/>
+        </w:trPr>
+        <w:tc>
+          <w:tcPr>
+            <w:tcW w:w="2352" w:type="dxa"/>
+            <w:tcBorders/>
+          </w:tcPr>
+          <w:p>
+            <w:pPr>
+              <w:pStyle w:val="Compact"/>
+              <w:widowControl/>
+              <w:spacing w:before="36" w:after="36"/>
+              <w:jc w:val="left"/>
+              <w:rPr>
+                <w:rFonts w:ascii="Cambria" w:hAnsi="Cambria" w:eastAsia="Cambria" w:cs=""/>
+                <w:kern w:val="0"/>
+                <w:szCs w:val="24"/>
+                <w:lang w:val="en-US" w:eastAsia="en-US" w:bidi="ar-SA"/>
+              </w:rPr>
+            </w:pPr>
+            <w:r>
+              <w:rPr>
+                <w:rFonts w:eastAsia="Cambria" w:cs=""/>
+                <w:b/>
+                <w:bCs/>
+                <w:kern w:val="0"/>
+                <w:sz w:val="19"/>
+                <w:szCs w:val="24"/>
+                <w:lang w:val="en-US" w:eastAsia="en-US" w:bidi="ar-SA"/>
+              </w:rPr>
               <w:t>Week 40</w:t>
             </w:r>
           </w:p>
@@ -15592,6 +16527,193 @@
                 <w:lang w:val="en-US" w:eastAsia="en-US" w:bidi="ar-SA"/>
               </w:rPr>
               <w:t>M14 (Analytics) — second reconciliation-time reading, trending favorably.</w:t>
+            </w:r>
+          </w:p>
+        </w:tc>
+        <w:tc>
+          <w:tcPr>
+            <w:tcW w:w="2351" w:type="dxa"/>
+            <w:tcBorders/>
+          </w:tcPr>
+          <w:p>
+            <w:pPr>
+              <w:pStyle w:val="Compact"/>
+              <w:widowControl/>
+              <w:spacing w:before="36" w:after="36"/>
+              <w:jc w:val="left"/>
+              <w:rPr>
+                <w:rFonts w:ascii="Cambria" w:hAnsi="Cambria" w:eastAsia="Cambria" w:cs=""/>
+                <w:kern w:val="0"/>
+                <w:szCs w:val="24"/>
+                <w:lang w:val="en-US" w:eastAsia="en-US" w:bidi="ar-SA"/>
+              </w:rPr>
+            </w:pPr>
+            <w:r>
+              <w:rPr>
+                <w:rFonts w:eastAsia="Cambria" w:cs=""/>
+                <w:kern w:val="0"/>
+                <w:sz w:val="19"/>
+                <w:szCs w:val="24"/>
+                <w:lang w:val="en-US" w:eastAsia="en-US" w:bidi="ar-SA"/>
+              </w:rPr>
+              <w:t>—</w:t>
+            </w:r>
+          </w:p>
+        </w:tc>
+        <w:tc>
+          <w:tcPr>
+            <w:tcW w:w="2352" w:type="dxa"/>
+            <w:tcBorders/>
+          </w:tcPr>
+          <w:p>
+            <w:pPr>
+              <w:pStyle w:val="Compact"/>
+              <w:widowControl/>
+              <w:spacing w:before="36" w:after="36"/>
+              <w:jc w:val="left"/>
+              <w:rPr>
+                <w:rFonts w:ascii="Cambria" w:hAnsi="Cambria" w:eastAsia="Cambria" w:cs=""/>
+                <w:kern w:val="0"/>
+                <w:szCs w:val="24"/>
+                <w:lang w:val="en-US" w:eastAsia="en-US" w:bidi="ar-SA"/>
+              </w:rPr>
+            </w:pPr>
+            <w:r>
+              <w:rPr>
+                <w:rFonts w:eastAsia="Cambria" w:cs=""/>
+                <w:kern w:val="0"/>
+                <w:sz w:val="19"/>
+                <w:szCs w:val="24"/>
+                <w:lang w:val="en-US" w:eastAsia="en-US" w:bidi="ar-SA"/>
+              </w:rPr>
+              <w:t>—</w:t>
+            </w:r>
+          </w:p>
+        </w:tc>
+      </w:tr>
+      <w:tr>
+        <w:trPr>
+          <w:cantSplit w:val="true"/>
+        </w:trPr>
+        <w:tc>
+          <w:tcPr>
+            <w:tcW w:w="2352" w:type="dxa"/>
+            <w:tcBorders/>
+          </w:tcPr>
+          <w:p>
+            <w:pPr>
+              <w:pStyle w:val="Compact"/>
+              <w:widowControl/>
+              <w:spacing w:before="36" w:after="36"/>
+              <w:jc w:val="left"/>
+              <w:rPr>
+                <w:rFonts w:ascii="Cambria" w:hAnsi="Cambria" w:eastAsia="Cambria" w:cs=""/>
+                <w:kern w:val="0"/>
+                <w:szCs w:val="24"/>
+                <w:lang w:val="en-US" w:eastAsia="en-US" w:bidi="ar-SA"/>
+              </w:rPr>
+            </w:pPr>
+            <w:r>
+              <w:rPr>
+                <w:rFonts w:eastAsia="Cambria" w:cs=""/>
+                <w:b/>
+                <w:bCs/>
+                <w:kern w:val="0"/>
+                <w:sz w:val="19"/>
+                <w:szCs w:val="24"/>
+                <w:lang w:val="en-US" w:eastAsia="en-US" w:bidi="ar-SA"/>
+              </w:rPr>
+              <w:t>Week 41</w:t>
+            </w:r>
+          </w:p>
+        </w:tc>
+        <w:tc>
+          <w:tcPr>
+            <w:tcW w:w="2351" w:type="dxa"/>
+            <w:tcBorders/>
+          </w:tcPr>
+          <w:p>
+            <w:pPr>
+              <w:pStyle w:val="Compact"/>
+              <w:widowControl/>
+              <w:spacing w:before="36" w:after="36"/>
+              <w:jc w:val="left"/>
+              <w:rPr>
+                <w:rFonts w:ascii="Cambria" w:hAnsi="Cambria" w:eastAsia="Cambria" w:cs=""/>
+                <w:kern w:val="0"/>
+                <w:szCs w:val="24"/>
+                <w:lang w:val="en-US" w:eastAsia="en-US" w:bidi="ar-SA"/>
+              </w:rPr>
+            </w:pPr>
+            <w:r>
+              <w:rPr>
+                <w:rFonts w:eastAsia="Cambria" w:cs=""/>
+                <w:kern w:val="0"/>
+                <w:sz w:val="19"/>
+                <w:szCs w:val="24"/>
+                <w:lang w:val="en-US" w:eastAsia="en-US" w:bidi="ar-SA"/>
+              </w:rPr>
+              <w:t>Continue monitoring.</w:t>
+            </w:r>
+          </w:p>
+        </w:tc>
+        <w:tc>
+          <w:tcPr>
+            <w:tcW w:w="2352" w:type="dxa"/>
+            <w:tcBorders/>
+          </w:tcPr>
+          <w:p>
+            <w:pPr>
+              <w:pStyle w:val="Compact"/>
+              <w:widowControl/>
+              <w:spacing w:before="36" w:after="36"/>
+              <w:jc w:val="left"/>
+              <w:rPr>
+                <w:rFonts w:ascii="Cambria" w:hAnsi="Cambria" w:eastAsia="Cambria" w:cs=""/>
+                <w:kern w:val="0"/>
+                <w:szCs w:val="24"/>
+                <w:lang w:val="en-US" w:eastAsia="en-US" w:bidi="ar-SA"/>
+              </w:rPr>
+            </w:pPr>
+            <w:r>
+              <w:rPr>
+                <w:rFonts w:eastAsia="Cambria" w:cs=""/>
+                <w:kern w:val="0"/>
+                <w:sz w:val="19"/>
+                <w:szCs w:val="24"/>
+                <w:lang w:val="en-US" w:eastAsia="en-US" w:bidi="ar-SA"/>
+              </w:rPr>
+              <w:t>—</w:t>
+            </w:r>
+          </w:p>
+        </w:tc>
+        <w:tc>
+          <w:tcPr>
+            <w:tcW w:w="2353" w:type="dxa"/>
+            <w:tcBorders/>
+          </w:tcPr>
+          <w:p>
+            <w:pPr>
+              <w:pStyle w:val="Compact"/>
+              <w:widowControl/>
+              <w:spacing w:before="36" w:after="36"/>
+              <w:jc w:val="left"/>
+              <w:rPr>
+                <w:rFonts w:ascii="Cambria" w:hAnsi="Cambria" w:eastAsia="Cambria" w:cs=""/>
+                <w:kern w:val="0"/>
+                <w:szCs w:val="24"/>
+                <w:lang w:val="en-US" w:eastAsia="en-US" w:bidi="ar-SA"/>
+              </w:rPr>
+            </w:pPr>
+            <w:r>
+              <w:rPr>
+                <w:rFonts w:eastAsia="Cambria" w:cs=""/>
+                <w:kern w:val="0"/>
+                <w:sz w:val="19"/>
+                <w:szCs w:val="24"/>
+                <w:lang w:val="en-US" w:eastAsia="en-US" w:bidi="ar-SA"/>
+              </w:rPr>
+              <w:t>M21 — routine log.</w:t>
             </w:r>
           </w:p>
         </w:tc>
@@ -16361,7 +17483,7 @@
                 <w:szCs w:val="24"/>
                 <w:lang w:val="en-US" w:eastAsia="en-US" w:bidi="ar-SA"/>
               </w:rPr>
-              <w:t>Week 45</w:t>
+              <w:t>Week 41</w:t>
             </w:r>
           </w:p>
         </w:tc>
@@ -16391,42 +17513,42 @@
                 <w:szCs w:val="24"/>
                 <w:lang w:val="en-US" w:eastAsia="en-US" w:bidi="ar-SA"/>
               </w:rPr>
+              <w:t>Continue sustainment planning.</w:t>
+            </w:r>
+          </w:p>
+        </w:tc>
+        <w:tc>
+          <w:tcPr>
+            <w:tcW w:w="2352" w:type="dxa"/>
+            <w:tcBorders/>
+          </w:tcPr>
+          <w:p>
+            <w:pPr>
+              <w:pStyle w:val="Compact"/>
+              <w:widowControl/>
+              <w:spacing w:before="36" w:after="36"/>
+              <w:jc w:val="left"/>
+              <w:rPr>
+                <w:rFonts w:ascii="Cambria" w:hAnsi="Cambria" w:eastAsia="Cambria" w:cs=""/>
+                <w:kern w:val="0"/>
+                <w:szCs w:val="24"/>
+                <w:lang w:val="en-US" w:eastAsia="en-US" w:bidi="ar-SA"/>
+              </w:rPr>
+            </w:pPr>
+            <w:r>
+              <w:rPr>
+                <w:rFonts w:eastAsia="Cambria" w:cs=""/>
+                <w:kern w:val="0"/>
+                <w:sz w:val="19"/>
+                <w:szCs w:val="24"/>
+                <w:lang w:val="en-US" w:eastAsia="en-US" w:bidi="ar-SA"/>
+              </w:rPr>
               <w:t>—</w:t>
             </w:r>
           </w:p>
         </w:tc>
         <w:tc>
           <w:tcPr>
-            <w:tcW w:w="2352" w:type="dxa"/>
-            <w:tcBorders/>
-          </w:tcPr>
-          <w:p>
-            <w:pPr>
-              <w:pStyle w:val="Compact"/>
-              <w:widowControl/>
-              <w:spacing w:before="36" w:after="36"/>
-              <w:jc w:val="left"/>
-              <w:rPr>
-                <w:rFonts w:ascii="Cambria" w:hAnsi="Cambria" w:eastAsia="Cambria" w:cs=""/>
-                <w:kern w:val="0"/>
-                <w:szCs w:val="24"/>
-                <w:lang w:val="en-US" w:eastAsia="en-US" w:bidi="ar-SA"/>
-              </w:rPr>
-            </w:pPr>
-            <w:r>
-              <w:rPr>
-                <w:rFonts w:eastAsia="Cambria" w:cs=""/>
-                <w:kern w:val="0"/>
-                <w:sz w:val="19"/>
-                <w:szCs w:val="24"/>
-                <w:lang w:val="en-US" w:eastAsia="en-US" w:bidi="ar-SA"/>
-              </w:rPr>
-              <w:t>Log quick wins from the redesigned process’s first full quarter.</w:t>
-            </w:r>
-          </w:p>
-        </w:tc>
-        <w:tc>
-          <w:tcPr>
             <w:tcW w:w="2353" w:type="dxa"/>
             <w:tcBorders/>
           </w:tcPr>
@@ -16451,7 +17573,7 @@
                 <w:szCs w:val="24"/>
                 <w:lang w:val="en-US" w:eastAsia="en-US" w:bidi="ar-SA"/>
               </w:rPr>
-              <w:t>M12 (Sustainment) — quick wins logged.</w:t>
+              <w:t>M21 — routine log.</w:t>
             </w:r>
           </w:p>
         </w:tc>
@@ -16481,7 +17603,7 @@
                 <w:szCs w:val="24"/>
                 <w:lang w:val="en-US" w:eastAsia="en-US" w:bidi="ar-SA"/>
               </w:rPr>
-              <w:t>—</w:t>
+              <w:t>(Phase 6 active)</w:t>
             </w:r>
           </w:p>
         </w:tc>
@@ -16548,6 +17670,1128 @@
                 <w:szCs w:val="24"/>
                 <w:lang w:val="en-US" w:eastAsia="en-US" w:bidi="ar-SA"/>
               </w:rPr>
+              <w:t>Week 42</w:t>
+            </w:r>
+          </w:p>
+        </w:tc>
+        <w:tc>
+          <w:tcPr>
+            <w:tcW w:w="2351" w:type="dxa"/>
+            <w:tcBorders/>
+          </w:tcPr>
+          <w:p>
+            <w:pPr>
+              <w:pStyle w:val="Compact"/>
+              <w:widowControl/>
+              <w:spacing w:before="36" w:after="36"/>
+              <w:jc w:val="left"/>
+              <w:rPr>
+                <w:rFonts w:ascii="Cambria" w:hAnsi="Cambria" w:eastAsia="Cambria" w:cs=""/>
+                <w:kern w:val="0"/>
+                <w:szCs w:val="24"/>
+                <w:lang w:val="en-US" w:eastAsia="en-US" w:bidi="ar-SA"/>
+              </w:rPr>
+            </w:pPr>
+            <w:r>
+              <w:rPr>
+                <w:rFonts w:eastAsia="Cambria" w:cs=""/>
+                <w:kern w:val="0"/>
+                <w:sz w:val="19"/>
+                <w:szCs w:val="24"/>
+                <w:lang w:val="en-US" w:eastAsia="en-US" w:bidi="ar-SA"/>
+              </w:rPr>
+              <w:t>Continue sustainment planning.</w:t>
+            </w:r>
+          </w:p>
+        </w:tc>
+        <w:tc>
+          <w:tcPr>
+            <w:tcW w:w="2352" w:type="dxa"/>
+            <w:tcBorders/>
+          </w:tcPr>
+          <w:p>
+            <w:pPr>
+              <w:pStyle w:val="Compact"/>
+              <w:widowControl/>
+              <w:spacing w:before="36" w:after="36"/>
+              <w:jc w:val="left"/>
+              <w:rPr>
+                <w:rFonts w:ascii="Cambria" w:hAnsi="Cambria" w:eastAsia="Cambria" w:cs=""/>
+                <w:kern w:val="0"/>
+                <w:szCs w:val="24"/>
+                <w:lang w:val="en-US" w:eastAsia="en-US" w:bidi="ar-SA"/>
+              </w:rPr>
+            </w:pPr>
+            <w:r>
+              <w:rPr>
+                <w:rFonts w:eastAsia="Cambria" w:cs=""/>
+                <w:kern w:val="0"/>
+                <w:sz w:val="19"/>
+                <w:szCs w:val="24"/>
+                <w:lang w:val="en-US" w:eastAsia="en-US" w:bidi="ar-SA"/>
+              </w:rPr>
+              <w:t>—</w:t>
+            </w:r>
+          </w:p>
+        </w:tc>
+        <w:tc>
+          <w:tcPr>
+            <w:tcW w:w="2353" w:type="dxa"/>
+            <w:tcBorders/>
+          </w:tcPr>
+          <w:p>
+            <w:pPr>
+              <w:pStyle w:val="Compact"/>
+              <w:widowControl/>
+              <w:spacing w:before="36" w:after="36"/>
+              <w:jc w:val="left"/>
+              <w:rPr>
+                <w:rFonts w:ascii="Cambria" w:hAnsi="Cambria" w:eastAsia="Cambria" w:cs=""/>
+                <w:kern w:val="0"/>
+                <w:szCs w:val="24"/>
+                <w:lang w:val="en-US" w:eastAsia="en-US" w:bidi="ar-SA"/>
+              </w:rPr>
+            </w:pPr>
+            <w:r>
+              <w:rPr>
+                <w:rFonts w:eastAsia="Cambria" w:cs=""/>
+                <w:kern w:val="0"/>
+                <w:sz w:val="19"/>
+                <w:szCs w:val="24"/>
+                <w:lang w:val="en-US" w:eastAsia="en-US" w:bidi="ar-SA"/>
+              </w:rPr>
+              <w:t>M21 — routine log.</w:t>
+            </w:r>
+          </w:p>
+        </w:tc>
+        <w:tc>
+          <w:tcPr>
+            <w:tcW w:w="2351" w:type="dxa"/>
+            <w:tcBorders/>
+          </w:tcPr>
+          <w:p>
+            <w:pPr>
+              <w:pStyle w:val="Compact"/>
+              <w:widowControl/>
+              <w:spacing w:before="36" w:after="36"/>
+              <w:jc w:val="left"/>
+              <w:rPr>
+                <w:rFonts w:ascii="Cambria" w:hAnsi="Cambria" w:eastAsia="Cambria" w:cs=""/>
+                <w:kern w:val="0"/>
+                <w:szCs w:val="24"/>
+                <w:lang w:val="en-US" w:eastAsia="en-US" w:bidi="ar-SA"/>
+              </w:rPr>
+            </w:pPr>
+            <w:r>
+              <w:rPr>
+                <w:rFonts w:eastAsia="Cambria" w:cs=""/>
+                <w:kern w:val="0"/>
+                <w:sz w:val="19"/>
+                <w:szCs w:val="24"/>
+                <w:lang w:val="en-US" w:eastAsia="en-US" w:bidi="ar-SA"/>
+              </w:rPr>
+              <w:t>(Phase 6 gate also closes this week)</w:t>
+            </w:r>
+          </w:p>
+        </w:tc>
+        <w:tc>
+          <w:tcPr>
+            <w:tcW w:w="2352" w:type="dxa"/>
+            <w:tcBorders/>
+          </w:tcPr>
+          <w:p>
+            <w:pPr>
+              <w:pStyle w:val="Compact"/>
+              <w:widowControl/>
+              <w:spacing w:before="36" w:after="36"/>
+              <w:jc w:val="left"/>
+              <w:rPr>
+                <w:rFonts w:ascii="Cambria" w:hAnsi="Cambria" w:eastAsia="Cambria" w:cs=""/>
+                <w:kern w:val="0"/>
+                <w:szCs w:val="24"/>
+                <w:lang w:val="en-US" w:eastAsia="en-US" w:bidi="ar-SA"/>
+              </w:rPr>
+            </w:pPr>
+            <w:r>
+              <w:rPr>
+                <w:rFonts w:eastAsia="Cambria" w:cs=""/>
+                <w:kern w:val="0"/>
+                <w:sz w:val="19"/>
+                <w:szCs w:val="24"/>
+                <w:lang w:val="en-US" w:eastAsia="en-US" w:bidi="ar-SA"/>
+              </w:rPr>
+              <w:t>—</w:t>
+            </w:r>
+          </w:p>
+        </w:tc>
+      </w:tr>
+      <w:tr>
+        <w:trPr>
+          <w:cantSplit w:val="true"/>
+        </w:trPr>
+        <w:tc>
+          <w:tcPr>
+            <w:tcW w:w="2352" w:type="dxa"/>
+            <w:tcBorders/>
+          </w:tcPr>
+          <w:p>
+            <w:pPr>
+              <w:pStyle w:val="Compact"/>
+              <w:widowControl/>
+              <w:spacing w:before="36" w:after="36"/>
+              <w:jc w:val="left"/>
+              <w:rPr>
+                <w:rFonts w:ascii="Cambria" w:hAnsi="Cambria" w:eastAsia="Cambria" w:cs=""/>
+                <w:kern w:val="0"/>
+                <w:szCs w:val="24"/>
+                <w:lang w:val="en-US" w:eastAsia="en-US" w:bidi="ar-SA"/>
+              </w:rPr>
+            </w:pPr>
+            <w:r>
+              <w:rPr>
+                <w:rFonts w:eastAsia="Cambria" w:cs=""/>
+                <w:b/>
+                <w:bCs/>
+                <w:kern w:val="0"/>
+                <w:sz w:val="19"/>
+                <w:szCs w:val="24"/>
+                <w:lang w:val="en-US" w:eastAsia="en-US" w:bidi="ar-SA"/>
+              </w:rPr>
+              <w:t>Week 43</w:t>
+            </w:r>
+          </w:p>
+        </w:tc>
+        <w:tc>
+          <w:tcPr>
+            <w:tcW w:w="2351" w:type="dxa"/>
+            <w:tcBorders/>
+          </w:tcPr>
+          <w:p>
+            <w:pPr>
+              <w:pStyle w:val="Compact"/>
+              <w:widowControl/>
+              <w:spacing w:before="36" w:after="36"/>
+              <w:jc w:val="left"/>
+              <w:rPr>
+                <w:rFonts w:ascii="Cambria" w:hAnsi="Cambria" w:eastAsia="Cambria" w:cs=""/>
+                <w:kern w:val="0"/>
+                <w:szCs w:val="24"/>
+                <w:lang w:val="en-US" w:eastAsia="en-US" w:bidi="ar-SA"/>
+              </w:rPr>
+            </w:pPr>
+            <w:r>
+              <w:rPr>
+                <w:rFonts w:eastAsia="Cambria" w:cs=""/>
+                <w:kern w:val="0"/>
+                <w:sz w:val="19"/>
+                <w:szCs w:val="24"/>
+                <w:lang w:val="en-US" w:eastAsia="en-US" w:bidi="ar-SA"/>
+              </w:rPr>
+              <w:t>—</w:t>
+            </w:r>
+          </w:p>
+        </w:tc>
+        <w:tc>
+          <w:tcPr>
+            <w:tcW w:w="2352" w:type="dxa"/>
+            <w:tcBorders/>
+          </w:tcPr>
+          <w:p>
+            <w:pPr>
+              <w:pStyle w:val="Compact"/>
+              <w:widowControl/>
+              <w:spacing w:before="36" w:after="36"/>
+              <w:jc w:val="left"/>
+              <w:rPr>
+                <w:rFonts w:ascii="Cambria" w:hAnsi="Cambria" w:eastAsia="Cambria" w:cs=""/>
+                <w:kern w:val="0"/>
+                <w:szCs w:val="24"/>
+                <w:lang w:val="en-US" w:eastAsia="en-US" w:bidi="ar-SA"/>
+              </w:rPr>
+            </w:pPr>
+            <w:r>
+              <w:rPr>
+                <w:rFonts w:eastAsia="Cambria" w:cs=""/>
+                <w:kern w:val="0"/>
+                <w:sz w:val="19"/>
+                <w:szCs w:val="24"/>
+                <w:lang w:val="en-US" w:eastAsia="en-US" w:bidi="ar-SA"/>
+              </w:rPr>
+              <w:t>Log the second sustainment checkpoint; reconciliation time holding steady.</w:t>
+            </w:r>
+          </w:p>
+        </w:tc>
+        <w:tc>
+          <w:tcPr>
+            <w:tcW w:w="2353" w:type="dxa"/>
+            <w:tcBorders/>
+          </w:tcPr>
+          <w:p>
+            <w:pPr>
+              <w:pStyle w:val="Compact"/>
+              <w:widowControl/>
+              <w:spacing w:before="36" w:after="36"/>
+              <w:jc w:val="left"/>
+              <w:rPr>
+                <w:rFonts w:ascii="Cambria" w:hAnsi="Cambria" w:eastAsia="Cambria" w:cs=""/>
+                <w:kern w:val="0"/>
+                <w:szCs w:val="24"/>
+                <w:lang w:val="en-US" w:eastAsia="en-US" w:bidi="ar-SA"/>
+              </w:rPr>
+            </w:pPr>
+            <w:r>
+              <w:rPr>
+                <w:rFonts w:eastAsia="Cambria" w:cs=""/>
+                <w:kern w:val="0"/>
+                <w:sz w:val="19"/>
+                <w:szCs w:val="24"/>
+                <w:lang w:val="en-US" w:eastAsia="en-US" w:bidi="ar-SA"/>
+              </w:rPr>
+              <w:t>M12 (Sustainment) — checkpoint 2 logged, no regression flagged.</w:t>
+            </w:r>
+          </w:p>
+        </w:tc>
+        <w:tc>
+          <w:tcPr>
+            <w:tcW w:w="2351" w:type="dxa"/>
+            <w:tcBorders/>
+          </w:tcPr>
+          <w:p>
+            <w:pPr>
+              <w:pStyle w:val="Compact"/>
+              <w:widowControl/>
+              <w:spacing w:before="36" w:after="36"/>
+              <w:jc w:val="left"/>
+              <w:rPr>
+                <w:rFonts w:ascii="Cambria" w:hAnsi="Cambria" w:eastAsia="Cambria" w:cs=""/>
+                <w:kern w:val="0"/>
+                <w:szCs w:val="24"/>
+                <w:lang w:val="en-US" w:eastAsia="en-US" w:bidi="ar-SA"/>
+              </w:rPr>
+            </w:pPr>
+            <w:r>
+              <w:rPr>
+                <w:rFonts w:eastAsia="Cambria" w:cs=""/>
+                <w:kern w:val="0"/>
+                <w:sz w:val="19"/>
+                <w:szCs w:val="24"/>
+                <w:lang w:val="en-US" w:eastAsia="en-US" w:bidi="ar-SA"/>
+              </w:rPr>
+              <w:t>—</w:t>
+            </w:r>
+          </w:p>
+        </w:tc>
+        <w:tc>
+          <w:tcPr>
+            <w:tcW w:w="2352" w:type="dxa"/>
+            <w:tcBorders/>
+          </w:tcPr>
+          <w:p>
+            <w:pPr>
+              <w:pStyle w:val="Compact"/>
+              <w:widowControl/>
+              <w:spacing w:before="36" w:after="36"/>
+              <w:jc w:val="left"/>
+              <w:rPr>
+                <w:rFonts w:ascii="Cambria" w:hAnsi="Cambria" w:eastAsia="Cambria" w:cs=""/>
+                <w:kern w:val="0"/>
+                <w:szCs w:val="24"/>
+                <w:lang w:val="en-US" w:eastAsia="en-US" w:bidi="ar-SA"/>
+              </w:rPr>
+            </w:pPr>
+            <w:r>
+              <w:rPr>
+                <w:rFonts w:eastAsia="Cambria" w:cs=""/>
+                <w:kern w:val="0"/>
+                <w:sz w:val="19"/>
+                <w:szCs w:val="24"/>
+                <w:lang w:val="en-US" w:eastAsia="en-US" w:bidi="ar-SA"/>
+              </w:rPr>
+              <w:t>—</w:t>
+            </w:r>
+          </w:p>
+        </w:tc>
+      </w:tr>
+      <w:tr>
+        <w:trPr>
+          <w:cantSplit w:val="true"/>
+        </w:trPr>
+        <w:tc>
+          <w:tcPr>
+            <w:tcW w:w="2352" w:type="dxa"/>
+            <w:tcBorders/>
+          </w:tcPr>
+          <w:p>
+            <w:pPr>
+              <w:pStyle w:val="Compact"/>
+              <w:widowControl/>
+              <w:spacing w:before="36" w:after="36"/>
+              <w:jc w:val="left"/>
+              <w:rPr>
+                <w:rFonts w:ascii="Cambria" w:hAnsi="Cambria" w:eastAsia="Cambria" w:cs=""/>
+                <w:kern w:val="0"/>
+                <w:szCs w:val="24"/>
+                <w:lang w:val="en-US" w:eastAsia="en-US" w:bidi="ar-SA"/>
+              </w:rPr>
+            </w:pPr>
+            <w:r>
+              <w:rPr>
+                <w:rFonts w:eastAsia="Cambria" w:cs=""/>
+                <w:b/>
+                <w:bCs/>
+                <w:kern w:val="0"/>
+                <w:sz w:val="19"/>
+                <w:szCs w:val="24"/>
+                <w:lang w:val="en-US" w:eastAsia="en-US" w:bidi="ar-SA"/>
+              </w:rPr>
+              <w:t>Week 44</w:t>
+            </w:r>
+          </w:p>
+        </w:tc>
+        <w:tc>
+          <w:tcPr>
+            <w:tcW w:w="2351" w:type="dxa"/>
+            <w:tcBorders/>
+          </w:tcPr>
+          <w:p>
+            <w:pPr>
+              <w:pStyle w:val="Compact"/>
+              <w:widowControl/>
+              <w:spacing w:before="36" w:after="36"/>
+              <w:jc w:val="left"/>
+              <w:rPr>
+                <w:rFonts w:ascii="Cambria" w:hAnsi="Cambria" w:eastAsia="Cambria" w:cs=""/>
+                <w:kern w:val="0"/>
+                <w:szCs w:val="24"/>
+                <w:lang w:val="en-US" w:eastAsia="en-US" w:bidi="ar-SA"/>
+              </w:rPr>
+            </w:pPr>
+            <w:r>
+              <w:rPr>
+                <w:rFonts w:eastAsia="Cambria" w:cs=""/>
+                <w:kern w:val="0"/>
+                <w:sz w:val="19"/>
+                <w:szCs w:val="24"/>
+                <w:lang w:val="en-US" w:eastAsia="en-US" w:bidi="ar-SA"/>
+              </w:rPr>
+              <w:t>—</w:t>
+            </w:r>
+          </w:p>
+        </w:tc>
+        <w:tc>
+          <w:tcPr>
+            <w:tcW w:w="2352" w:type="dxa"/>
+            <w:tcBorders/>
+          </w:tcPr>
+          <w:p>
+            <w:pPr>
+              <w:pStyle w:val="Compact"/>
+              <w:widowControl/>
+              <w:spacing w:before="36" w:after="36"/>
+              <w:jc w:val="left"/>
+              <w:rPr>
+                <w:rFonts w:ascii="Cambria" w:hAnsi="Cambria" w:eastAsia="Cambria" w:cs=""/>
+                <w:kern w:val="0"/>
+                <w:szCs w:val="24"/>
+                <w:lang w:val="en-US" w:eastAsia="en-US" w:bidi="ar-SA"/>
+              </w:rPr>
+            </w:pPr>
+            <w:r>
+              <w:rPr>
+                <w:rFonts w:eastAsia="Cambria" w:cs=""/>
+                <w:kern w:val="0"/>
+                <w:sz w:val="19"/>
+                <w:szCs w:val="24"/>
+                <w:lang w:val="en-US" w:eastAsia="en-US" w:bidi="ar-SA"/>
+              </w:rPr>
+              <w:t>Continue monitoring.</w:t>
+            </w:r>
+          </w:p>
+        </w:tc>
+        <w:tc>
+          <w:tcPr>
+            <w:tcW w:w="2353" w:type="dxa"/>
+            <w:tcBorders/>
+          </w:tcPr>
+          <w:p>
+            <w:pPr>
+              <w:pStyle w:val="Compact"/>
+              <w:widowControl/>
+              <w:spacing w:before="36" w:after="36"/>
+              <w:jc w:val="left"/>
+              <w:rPr>
+                <w:rFonts w:ascii="Cambria" w:hAnsi="Cambria" w:eastAsia="Cambria" w:cs=""/>
+                <w:kern w:val="0"/>
+                <w:szCs w:val="24"/>
+                <w:lang w:val="en-US" w:eastAsia="en-US" w:bidi="ar-SA"/>
+              </w:rPr>
+            </w:pPr>
+            <w:r>
+              <w:rPr>
+                <w:rFonts w:eastAsia="Cambria" w:cs=""/>
+                <w:kern w:val="0"/>
+                <w:sz w:val="19"/>
+                <w:szCs w:val="24"/>
+                <w:lang w:val="en-US" w:eastAsia="en-US" w:bidi="ar-SA"/>
+              </w:rPr>
+              <w:t>M21 — routine log.</w:t>
+            </w:r>
+          </w:p>
+        </w:tc>
+        <w:tc>
+          <w:tcPr>
+            <w:tcW w:w="2351" w:type="dxa"/>
+            <w:tcBorders/>
+          </w:tcPr>
+          <w:p>
+            <w:pPr>
+              <w:pStyle w:val="Compact"/>
+              <w:widowControl/>
+              <w:spacing w:before="36" w:after="36"/>
+              <w:jc w:val="left"/>
+              <w:rPr>
+                <w:rFonts w:ascii="Cambria" w:hAnsi="Cambria" w:eastAsia="Cambria" w:cs=""/>
+                <w:kern w:val="0"/>
+                <w:szCs w:val="24"/>
+                <w:lang w:val="en-US" w:eastAsia="en-US" w:bidi="ar-SA"/>
+              </w:rPr>
+            </w:pPr>
+            <w:r>
+              <w:rPr>
+                <w:rFonts w:eastAsia="Cambria" w:cs=""/>
+                <w:kern w:val="0"/>
+                <w:sz w:val="19"/>
+                <w:szCs w:val="24"/>
+                <w:lang w:val="en-US" w:eastAsia="en-US" w:bidi="ar-SA"/>
+              </w:rPr>
+              <w:t>—</w:t>
+            </w:r>
+          </w:p>
+        </w:tc>
+        <w:tc>
+          <w:tcPr>
+            <w:tcW w:w="2352" w:type="dxa"/>
+            <w:tcBorders/>
+          </w:tcPr>
+          <w:p>
+            <w:pPr>
+              <w:pStyle w:val="Compact"/>
+              <w:widowControl/>
+              <w:spacing w:before="36" w:after="36"/>
+              <w:jc w:val="left"/>
+              <w:rPr>
+                <w:rFonts w:ascii="Cambria" w:hAnsi="Cambria" w:eastAsia="Cambria" w:cs=""/>
+                <w:kern w:val="0"/>
+                <w:szCs w:val="24"/>
+                <w:lang w:val="en-US" w:eastAsia="en-US" w:bidi="ar-SA"/>
+              </w:rPr>
+            </w:pPr>
+            <w:r>
+              <w:rPr>
+                <w:rFonts w:eastAsia="Cambria" w:cs=""/>
+                <w:kern w:val="0"/>
+                <w:sz w:val="19"/>
+                <w:szCs w:val="24"/>
+                <w:lang w:val="en-US" w:eastAsia="en-US" w:bidi="ar-SA"/>
+              </w:rPr>
+              <w:t>—</w:t>
+            </w:r>
+          </w:p>
+        </w:tc>
+      </w:tr>
+      <w:tr>
+        <w:trPr>
+          <w:cantSplit w:val="true"/>
+        </w:trPr>
+        <w:tc>
+          <w:tcPr>
+            <w:tcW w:w="2352" w:type="dxa"/>
+            <w:tcBorders/>
+          </w:tcPr>
+          <w:p>
+            <w:pPr>
+              <w:pStyle w:val="Compact"/>
+              <w:widowControl/>
+              <w:spacing w:before="36" w:after="36"/>
+              <w:jc w:val="left"/>
+              <w:rPr>
+                <w:rFonts w:ascii="Cambria" w:hAnsi="Cambria" w:eastAsia="Cambria" w:cs=""/>
+                <w:kern w:val="0"/>
+                <w:szCs w:val="24"/>
+                <w:lang w:val="en-US" w:eastAsia="en-US" w:bidi="ar-SA"/>
+              </w:rPr>
+            </w:pPr>
+            <w:r>
+              <w:rPr>
+                <w:rFonts w:eastAsia="Cambria" w:cs=""/>
+                <w:b/>
+                <w:bCs/>
+                <w:kern w:val="0"/>
+                <w:sz w:val="19"/>
+                <w:szCs w:val="24"/>
+                <w:lang w:val="en-US" w:eastAsia="en-US" w:bidi="ar-SA"/>
+              </w:rPr>
+              <w:t>Week 45</w:t>
+            </w:r>
+          </w:p>
+        </w:tc>
+        <w:tc>
+          <w:tcPr>
+            <w:tcW w:w="2351" w:type="dxa"/>
+            <w:tcBorders/>
+          </w:tcPr>
+          <w:p>
+            <w:pPr>
+              <w:pStyle w:val="Compact"/>
+              <w:widowControl/>
+              <w:spacing w:before="36" w:after="36"/>
+              <w:jc w:val="left"/>
+              <w:rPr>
+                <w:rFonts w:ascii="Cambria" w:hAnsi="Cambria" w:eastAsia="Cambria" w:cs=""/>
+                <w:kern w:val="0"/>
+                <w:szCs w:val="24"/>
+                <w:lang w:val="en-US" w:eastAsia="en-US" w:bidi="ar-SA"/>
+              </w:rPr>
+            </w:pPr>
+            <w:r>
+              <w:rPr>
+                <w:rFonts w:eastAsia="Cambria" w:cs=""/>
+                <w:kern w:val="0"/>
+                <w:sz w:val="19"/>
+                <w:szCs w:val="24"/>
+                <w:lang w:val="en-US" w:eastAsia="en-US" w:bidi="ar-SA"/>
+              </w:rPr>
+              <w:t>—</w:t>
+            </w:r>
+          </w:p>
+        </w:tc>
+        <w:tc>
+          <w:tcPr>
+            <w:tcW w:w="2352" w:type="dxa"/>
+            <w:tcBorders/>
+          </w:tcPr>
+          <w:p>
+            <w:pPr>
+              <w:pStyle w:val="Compact"/>
+              <w:widowControl/>
+              <w:spacing w:before="36" w:after="36"/>
+              <w:jc w:val="left"/>
+              <w:rPr>
+                <w:rFonts w:ascii="Cambria" w:hAnsi="Cambria" w:eastAsia="Cambria" w:cs=""/>
+                <w:kern w:val="0"/>
+                <w:szCs w:val="24"/>
+                <w:lang w:val="en-US" w:eastAsia="en-US" w:bidi="ar-SA"/>
+              </w:rPr>
+            </w:pPr>
+            <w:r>
+              <w:rPr>
+                <w:rFonts w:eastAsia="Cambria" w:cs=""/>
+                <w:kern w:val="0"/>
+                <w:sz w:val="19"/>
+                <w:szCs w:val="24"/>
+                <w:lang w:val="en-US" w:eastAsia="en-US" w:bidi="ar-SA"/>
+              </w:rPr>
+              <w:t>Log quick wins from the redesigned process’s first full quarter.</w:t>
+            </w:r>
+          </w:p>
+        </w:tc>
+        <w:tc>
+          <w:tcPr>
+            <w:tcW w:w="2353" w:type="dxa"/>
+            <w:tcBorders/>
+          </w:tcPr>
+          <w:p>
+            <w:pPr>
+              <w:pStyle w:val="Compact"/>
+              <w:widowControl/>
+              <w:spacing w:before="36" w:after="36"/>
+              <w:jc w:val="left"/>
+              <w:rPr>
+                <w:rFonts w:ascii="Cambria" w:hAnsi="Cambria" w:eastAsia="Cambria" w:cs=""/>
+                <w:kern w:val="0"/>
+                <w:szCs w:val="24"/>
+                <w:lang w:val="en-US" w:eastAsia="en-US" w:bidi="ar-SA"/>
+              </w:rPr>
+            </w:pPr>
+            <w:r>
+              <w:rPr>
+                <w:rFonts w:eastAsia="Cambria" w:cs=""/>
+                <w:kern w:val="0"/>
+                <w:sz w:val="19"/>
+                <w:szCs w:val="24"/>
+                <w:lang w:val="en-US" w:eastAsia="en-US" w:bidi="ar-SA"/>
+              </w:rPr>
+              <w:t>M12 (Sustainment) — quick wins logged.</w:t>
+            </w:r>
+          </w:p>
+        </w:tc>
+        <w:tc>
+          <w:tcPr>
+            <w:tcW w:w="2351" w:type="dxa"/>
+            <w:tcBorders/>
+          </w:tcPr>
+          <w:p>
+            <w:pPr>
+              <w:pStyle w:val="Compact"/>
+              <w:widowControl/>
+              <w:spacing w:before="36" w:after="36"/>
+              <w:jc w:val="left"/>
+              <w:rPr>
+                <w:rFonts w:ascii="Cambria" w:hAnsi="Cambria" w:eastAsia="Cambria" w:cs=""/>
+                <w:kern w:val="0"/>
+                <w:szCs w:val="24"/>
+                <w:lang w:val="en-US" w:eastAsia="en-US" w:bidi="ar-SA"/>
+              </w:rPr>
+            </w:pPr>
+            <w:r>
+              <w:rPr>
+                <w:rFonts w:eastAsia="Cambria" w:cs=""/>
+                <w:kern w:val="0"/>
+                <w:sz w:val="19"/>
+                <w:szCs w:val="24"/>
+                <w:lang w:val="en-US" w:eastAsia="en-US" w:bidi="ar-SA"/>
+              </w:rPr>
+              <w:t>—</w:t>
+            </w:r>
+          </w:p>
+        </w:tc>
+        <w:tc>
+          <w:tcPr>
+            <w:tcW w:w="2352" w:type="dxa"/>
+            <w:tcBorders/>
+          </w:tcPr>
+          <w:p>
+            <w:pPr>
+              <w:pStyle w:val="Compact"/>
+              <w:widowControl/>
+              <w:spacing w:before="36" w:after="36"/>
+              <w:jc w:val="left"/>
+              <w:rPr>
+                <w:rFonts w:ascii="Cambria" w:hAnsi="Cambria" w:eastAsia="Cambria" w:cs=""/>
+                <w:kern w:val="0"/>
+                <w:szCs w:val="24"/>
+                <w:lang w:val="en-US" w:eastAsia="en-US" w:bidi="ar-SA"/>
+              </w:rPr>
+            </w:pPr>
+            <w:r>
+              <w:rPr>
+                <w:rFonts w:eastAsia="Cambria" w:cs=""/>
+                <w:kern w:val="0"/>
+                <w:sz w:val="19"/>
+                <w:szCs w:val="24"/>
+                <w:lang w:val="en-US" w:eastAsia="en-US" w:bidi="ar-SA"/>
+              </w:rPr>
+              <w:t>—</w:t>
+            </w:r>
+          </w:p>
+        </w:tc>
+      </w:tr>
+      <w:tr>
+        <w:trPr>
+          <w:cantSplit w:val="true"/>
+        </w:trPr>
+        <w:tc>
+          <w:tcPr>
+            <w:tcW w:w="2352" w:type="dxa"/>
+            <w:tcBorders/>
+          </w:tcPr>
+          <w:p>
+            <w:pPr>
+              <w:pStyle w:val="Compact"/>
+              <w:widowControl/>
+              <w:spacing w:before="36" w:after="36"/>
+              <w:jc w:val="left"/>
+              <w:rPr>
+                <w:rFonts w:ascii="Cambria" w:hAnsi="Cambria" w:eastAsia="Cambria" w:cs=""/>
+                <w:kern w:val="0"/>
+                <w:szCs w:val="24"/>
+                <w:lang w:val="en-US" w:eastAsia="en-US" w:bidi="ar-SA"/>
+              </w:rPr>
+            </w:pPr>
+            <w:r>
+              <w:rPr>
+                <w:rFonts w:eastAsia="Cambria" w:cs=""/>
+                <w:b/>
+                <w:bCs/>
+                <w:kern w:val="0"/>
+                <w:sz w:val="19"/>
+                <w:szCs w:val="24"/>
+                <w:lang w:val="en-US" w:eastAsia="en-US" w:bidi="ar-SA"/>
+              </w:rPr>
+              <w:t>Week 46</w:t>
+            </w:r>
+          </w:p>
+        </w:tc>
+        <w:tc>
+          <w:tcPr>
+            <w:tcW w:w="2351" w:type="dxa"/>
+            <w:tcBorders/>
+          </w:tcPr>
+          <w:p>
+            <w:pPr>
+              <w:pStyle w:val="Compact"/>
+              <w:widowControl/>
+              <w:spacing w:before="36" w:after="36"/>
+              <w:jc w:val="left"/>
+              <w:rPr>
+                <w:rFonts w:ascii="Cambria" w:hAnsi="Cambria" w:eastAsia="Cambria" w:cs=""/>
+                <w:kern w:val="0"/>
+                <w:szCs w:val="24"/>
+                <w:lang w:val="en-US" w:eastAsia="en-US" w:bidi="ar-SA"/>
+              </w:rPr>
+            </w:pPr>
+            <w:r>
+              <w:rPr>
+                <w:rFonts w:eastAsia="Cambria" w:cs=""/>
+                <w:kern w:val="0"/>
+                <w:sz w:val="19"/>
+                <w:szCs w:val="24"/>
+                <w:lang w:val="en-US" w:eastAsia="en-US" w:bidi="ar-SA"/>
+              </w:rPr>
+              <w:t>—</w:t>
+            </w:r>
+          </w:p>
+        </w:tc>
+        <w:tc>
+          <w:tcPr>
+            <w:tcW w:w="2352" w:type="dxa"/>
+            <w:tcBorders/>
+          </w:tcPr>
+          <w:p>
+            <w:pPr>
+              <w:pStyle w:val="Compact"/>
+              <w:widowControl/>
+              <w:spacing w:before="36" w:after="36"/>
+              <w:jc w:val="left"/>
+              <w:rPr>
+                <w:rFonts w:ascii="Cambria" w:hAnsi="Cambria" w:eastAsia="Cambria" w:cs=""/>
+                <w:kern w:val="0"/>
+                <w:szCs w:val="24"/>
+                <w:lang w:val="en-US" w:eastAsia="en-US" w:bidi="ar-SA"/>
+              </w:rPr>
+            </w:pPr>
+            <w:r>
+              <w:rPr>
+                <w:rFonts w:eastAsia="Cambria" w:cs=""/>
+                <w:kern w:val="0"/>
+                <w:sz w:val="19"/>
+                <w:szCs w:val="24"/>
+                <w:lang w:val="en-US" w:eastAsia="en-US" w:bidi="ar-SA"/>
+              </w:rPr>
+              <w:t>Continue monitoring.</w:t>
+            </w:r>
+          </w:p>
+        </w:tc>
+        <w:tc>
+          <w:tcPr>
+            <w:tcW w:w="2353" w:type="dxa"/>
+            <w:tcBorders/>
+          </w:tcPr>
+          <w:p>
+            <w:pPr>
+              <w:pStyle w:val="Compact"/>
+              <w:widowControl/>
+              <w:spacing w:before="36" w:after="36"/>
+              <w:jc w:val="left"/>
+              <w:rPr>
+                <w:rFonts w:ascii="Cambria" w:hAnsi="Cambria" w:eastAsia="Cambria" w:cs=""/>
+                <w:kern w:val="0"/>
+                <w:szCs w:val="24"/>
+                <w:lang w:val="en-US" w:eastAsia="en-US" w:bidi="ar-SA"/>
+              </w:rPr>
+            </w:pPr>
+            <w:r>
+              <w:rPr>
+                <w:rFonts w:eastAsia="Cambria" w:cs=""/>
+                <w:kern w:val="0"/>
+                <w:sz w:val="19"/>
+                <w:szCs w:val="24"/>
+                <w:lang w:val="en-US" w:eastAsia="en-US" w:bidi="ar-SA"/>
+              </w:rPr>
+              <w:t>M21 — routine log.</w:t>
+            </w:r>
+          </w:p>
+        </w:tc>
+        <w:tc>
+          <w:tcPr>
+            <w:tcW w:w="2351" w:type="dxa"/>
+            <w:tcBorders/>
+          </w:tcPr>
+          <w:p>
+            <w:pPr>
+              <w:pStyle w:val="Compact"/>
+              <w:widowControl/>
+              <w:spacing w:before="36" w:after="36"/>
+              <w:jc w:val="left"/>
+              <w:rPr>
+                <w:rFonts w:ascii="Cambria" w:hAnsi="Cambria" w:eastAsia="Cambria" w:cs=""/>
+                <w:kern w:val="0"/>
+                <w:szCs w:val="24"/>
+                <w:lang w:val="en-US" w:eastAsia="en-US" w:bidi="ar-SA"/>
+              </w:rPr>
+            </w:pPr>
+            <w:r>
+              <w:rPr>
+                <w:rFonts w:eastAsia="Cambria" w:cs=""/>
+                <w:kern w:val="0"/>
+                <w:sz w:val="19"/>
+                <w:szCs w:val="24"/>
+                <w:lang w:val="en-US" w:eastAsia="en-US" w:bidi="ar-SA"/>
+              </w:rPr>
+              <w:t>—</w:t>
+            </w:r>
+          </w:p>
+        </w:tc>
+        <w:tc>
+          <w:tcPr>
+            <w:tcW w:w="2352" w:type="dxa"/>
+            <w:tcBorders/>
+          </w:tcPr>
+          <w:p>
+            <w:pPr>
+              <w:pStyle w:val="Compact"/>
+              <w:widowControl/>
+              <w:spacing w:before="36" w:after="36"/>
+              <w:jc w:val="left"/>
+              <w:rPr>
+                <w:rFonts w:ascii="Cambria" w:hAnsi="Cambria" w:eastAsia="Cambria" w:cs=""/>
+                <w:kern w:val="0"/>
+                <w:szCs w:val="24"/>
+                <w:lang w:val="en-US" w:eastAsia="en-US" w:bidi="ar-SA"/>
+              </w:rPr>
+            </w:pPr>
+            <w:r>
+              <w:rPr>
+                <w:rFonts w:eastAsia="Cambria" w:cs=""/>
+                <w:kern w:val="0"/>
+                <w:sz w:val="19"/>
+                <w:szCs w:val="24"/>
+                <w:lang w:val="en-US" w:eastAsia="en-US" w:bidi="ar-SA"/>
+              </w:rPr>
+              <w:t>—</w:t>
+            </w:r>
+          </w:p>
+        </w:tc>
+      </w:tr>
+      <w:tr>
+        <w:trPr>
+          <w:cantSplit w:val="true"/>
+        </w:trPr>
+        <w:tc>
+          <w:tcPr>
+            <w:tcW w:w="2352" w:type="dxa"/>
+            <w:tcBorders/>
+          </w:tcPr>
+          <w:p>
+            <w:pPr>
+              <w:pStyle w:val="Compact"/>
+              <w:widowControl/>
+              <w:spacing w:before="36" w:after="36"/>
+              <w:jc w:val="left"/>
+              <w:rPr>
+                <w:rFonts w:ascii="Cambria" w:hAnsi="Cambria" w:eastAsia="Cambria" w:cs=""/>
+                <w:kern w:val="0"/>
+                <w:szCs w:val="24"/>
+                <w:lang w:val="en-US" w:eastAsia="en-US" w:bidi="ar-SA"/>
+              </w:rPr>
+            </w:pPr>
+            <w:r>
+              <w:rPr>
+                <w:rFonts w:eastAsia="Cambria" w:cs=""/>
+                <w:b/>
+                <w:bCs/>
+                <w:kern w:val="0"/>
+                <w:sz w:val="19"/>
+                <w:szCs w:val="24"/>
+                <w:lang w:val="en-US" w:eastAsia="en-US" w:bidi="ar-SA"/>
+              </w:rPr>
+              <w:t>Week 47</w:t>
+            </w:r>
+          </w:p>
+        </w:tc>
+        <w:tc>
+          <w:tcPr>
+            <w:tcW w:w="2351" w:type="dxa"/>
+            <w:tcBorders/>
+          </w:tcPr>
+          <w:p>
+            <w:pPr>
+              <w:pStyle w:val="Compact"/>
+              <w:widowControl/>
+              <w:spacing w:before="36" w:after="36"/>
+              <w:jc w:val="left"/>
+              <w:rPr>
+                <w:rFonts w:ascii="Cambria" w:hAnsi="Cambria" w:eastAsia="Cambria" w:cs=""/>
+                <w:kern w:val="0"/>
+                <w:szCs w:val="24"/>
+                <w:lang w:val="en-US" w:eastAsia="en-US" w:bidi="ar-SA"/>
+              </w:rPr>
+            </w:pPr>
+            <w:r>
+              <w:rPr>
+                <w:rFonts w:eastAsia="Cambria" w:cs=""/>
+                <w:kern w:val="0"/>
+                <w:sz w:val="19"/>
+                <w:szCs w:val="24"/>
+                <w:lang w:val="en-US" w:eastAsia="en-US" w:bidi="ar-SA"/>
+              </w:rPr>
+              <w:t>—</w:t>
+            </w:r>
+          </w:p>
+        </w:tc>
+        <w:tc>
+          <w:tcPr>
+            <w:tcW w:w="2352" w:type="dxa"/>
+            <w:tcBorders/>
+          </w:tcPr>
+          <w:p>
+            <w:pPr>
+              <w:pStyle w:val="Compact"/>
+              <w:widowControl/>
+              <w:spacing w:before="36" w:after="36"/>
+              <w:jc w:val="left"/>
+              <w:rPr>
+                <w:rFonts w:ascii="Cambria" w:hAnsi="Cambria" w:eastAsia="Cambria" w:cs=""/>
+                <w:kern w:val="0"/>
+                <w:szCs w:val="24"/>
+                <w:lang w:val="en-US" w:eastAsia="en-US" w:bidi="ar-SA"/>
+              </w:rPr>
+            </w:pPr>
+            <w:r>
+              <w:rPr>
+                <w:rFonts w:eastAsia="Cambria" w:cs=""/>
+                <w:kern w:val="0"/>
+                <w:sz w:val="19"/>
+                <w:szCs w:val="24"/>
+                <w:lang w:val="en-US" w:eastAsia="en-US" w:bidi="ar-SA"/>
+              </w:rPr>
+              <w:t>Continue monitoring ahead of the handover package.</w:t>
+            </w:r>
+          </w:p>
+        </w:tc>
+        <w:tc>
+          <w:tcPr>
+            <w:tcW w:w="2353" w:type="dxa"/>
+            <w:tcBorders/>
+          </w:tcPr>
+          <w:p>
+            <w:pPr>
+              <w:pStyle w:val="Compact"/>
+              <w:widowControl/>
+              <w:spacing w:before="36" w:after="36"/>
+              <w:jc w:val="left"/>
+              <w:rPr>
+                <w:rFonts w:ascii="Cambria" w:hAnsi="Cambria" w:eastAsia="Cambria" w:cs=""/>
+                <w:kern w:val="0"/>
+                <w:szCs w:val="24"/>
+                <w:lang w:val="en-US" w:eastAsia="en-US" w:bidi="ar-SA"/>
+              </w:rPr>
+            </w:pPr>
+            <w:r>
+              <w:rPr>
+                <w:rFonts w:eastAsia="Cambria" w:cs=""/>
+                <w:kern w:val="0"/>
+                <w:sz w:val="19"/>
+                <w:szCs w:val="24"/>
+                <w:lang w:val="en-US" w:eastAsia="en-US" w:bidi="ar-SA"/>
+              </w:rPr>
+              <w:t>M21 — routine log.</w:t>
+            </w:r>
+          </w:p>
+        </w:tc>
+        <w:tc>
+          <w:tcPr>
+            <w:tcW w:w="2351" w:type="dxa"/>
+            <w:tcBorders/>
+          </w:tcPr>
+          <w:p>
+            <w:pPr>
+              <w:pStyle w:val="Compact"/>
+              <w:widowControl/>
+              <w:spacing w:before="36" w:after="36"/>
+              <w:jc w:val="left"/>
+              <w:rPr>
+                <w:rFonts w:ascii="Cambria" w:hAnsi="Cambria" w:eastAsia="Cambria" w:cs=""/>
+                <w:kern w:val="0"/>
+                <w:szCs w:val="24"/>
+                <w:lang w:val="en-US" w:eastAsia="en-US" w:bidi="ar-SA"/>
+              </w:rPr>
+            </w:pPr>
+            <w:r>
+              <w:rPr>
+                <w:rFonts w:eastAsia="Cambria" w:cs=""/>
+                <w:kern w:val="0"/>
+                <w:sz w:val="19"/>
+                <w:szCs w:val="24"/>
+                <w:lang w:val="en-US" w:eastAsia="en-US" w:bidi="ar-SA"/>
+              </w:rPr>
+              <w:t>—</w:t>
+            </w:r>
+          </w:p>
+        </w:tc>
+        <w:tc>
+          <w:tcPr>
+            <w:tcW w:w="2352" w:type="dxa"/>
+            <w:tcBorders/>
+          </w:tcPr>
+          <w:p>
+            <w:pPr>
+              <w:pStyle w:val="Compact"/>
+              <w:widowControl/>
+              <w:spacing w:before="36" w:after="36"/>
+              <w:jc w:val="left"/>
+              <w:rPr>
+                <w:rFonts w:ascii="Cambria" w:hAnsi="Cambria" w:eastAsia="Cambria" w:cs=""/>
+                <w:kern w:val="0"/>
+                <w:szCs w:val="24"/>
+                <w:lang w:val="en-US" w:eastAsia="en-US" w:bidi="ar-SA"/>
+              </w:rPr>
+            </w:pPr>
+            <w:r>
+              <w:rPr>
+                <w:rFonts w:eastAsia="Cambria" w:cs=""/>
+                <w:kern w:val="0"/>
+                <w:sz w:val="19"/>
+                <w:szCs w:val="24"/>
+                <w:lang w:val="en-US" w:eastAsia="en-US" w:bidi="ar-SA"/>
+              </w:rPr>
+              <w:t>—</w:t>
+            </w:r>
+          </w:p>
+        </w:tc>
+      </w:tr>
+      <w:tr>
+        <w:trPr>
+          <w:cantSplit w:val="true"/>
+        </w:trPr>
+        <w:tc>
+          <w:tcPr>
+            <w:tcW w:w="2352" w:type="dxa"/>
+            <w:tcBorders/>
+          </w:tcPr>
+          <w:p>
+            <w:pPr>
+              <w:pStyle w:val="Compact"/>
+              <w:widowControl/>
+              <w:spacing w:before="36" w:after="36"/>
+              <w:jc w:val="left"/>
+              <w:rPr>
+                <w:rFonts w:ascii="Cambria" w:hAnsi="Cambria" w:eastAsia="Cambria" w:cs=""/>
+                <w:kern w:val="0"/>
+                <w:szCs w:val="24"/>
+                <w:lang w:val="en-US" w:eastAsia="en-US" w:bidi="ar-SA"/>
+              </w:rPr>
+            </w:pPr>
+            <w:r>
+              <w:rPr>
+                <w:rFonts w:eastAsia="Cambria" w:cs=""/>
+                <w:b/>
+                <w:bCs/>
+                <w:kern w:val="0"/>
+                <w:sz w:val="19"/>
+                <w:szCs w:val="24"/>
+                <w:lang w:val="en-US" w:eastAsia="en-US" w:bidi="ar-SA"/>
+              </w:rPr>
               <w:t>Week 48</w:t>
             </w:r>
           </w:p>
@@ -16639,6 +18883,193 @@
                 <w:lang w:val="en-US" w:eastAsia="en-US" w:bidi="ar-SA"/>
               </w:rPr>
               <w:t>M14 (Analytics) — second consecutive favorable reading.</w:t>
+            </w:r>
+          </w:p>
+        </w:tc>
+        <w:tc>
+          <w:tcPr>
+            <w:tcW w:w="2351" w:type="dxa"/>
+            <w:tcBorders/>
+          </w:tcPr>
+          <w:p>
+            <w:pPr>
+              <w:pStyle w:val="Compact"/>
+              <w:widowControl/>
+              <w:spacing w:before="36" w:after="36"/>
+              <w:jc w:val="left"/>
+              <w:rPr>
+                <w:rFonts w:ascii="Cambria" w:hAnsi="Cambria" w:eastAsia="Cambria" w:cs=""/>
+                <w:kern w:val="0"/>
+                <w:szCs w:val="24"/>
+                <w:lang w:val="en-US" w:eastAsia="en-US" w:bidi="ar-SA"/>
+              </w:rPr>
+            </w:pPr>
+            <w:r>
+              <w:rPr>
+                <w:rFonts w:eastAsia="Cambria" w:cs=""/>
+                <w:kern w:val="0"/>
+                <w:sz w:val="19"/>
+                <w:szCs w:val="24"/>
+                <w:lang w:val="en-US" w:eastAsia="en-US" w:bidi="ar-SA"/>
+              </w:rPr>
+              <w:t>—</w:t>
+            </w:r>
+          </w:p>
+        </w:tc>
+        <w:tc>
+          <w:tcPr>
+            <w:tcW w:w="2352" w:type="dxa"/>
+            <w:tcBorders/>
+          </w:tcPr>
+          <w:p>
+            <w:pPr>
+              <w:pStyle w:val="Compact"/>
+              <w:widowControl/>
+              <w:spacing w:before="36" w:after="36"/>
+              <w:jc w:val="left"/>
+              <w:rPr>
+                <w:rFonts w:ascii="Cambria" w:hAnsi="Cambria" w:eastAsia="Cambria" w:cs=""/>
+                <w:kern w:val="0"/>
+                <w:szCs w:val="24"/>
+                <w:lang w:val="en-US" w:eastAsia="en-US" w:bidi="ar-SA"/>
+              </w:rPr>
+            </w:pPr>
+            <w:r>
+              <w:rPr>
+                <w:rFonts w:eastAsia="Cambria" w:cs=""/>
+                <w:kern w:val="0"/>
+                <w:sz w:val="19"/>
+                <w:szCs w:val="24"/>
+                <w:lang w:val="en-US" w:eastAsia="en-US" w:bidi="ar-SA"/>
+              </w:rPr>
+              <w:t>—</w:t>
+            </w:r>
+          </w:p>
+        </w:tc>
+      </w:tr>
+      <w:tr>
+        <w:trPr>
+          <w:cantSplit w:val="true"/>
+        </w:trPr>
+        <w:tc>
+          <w:tcPr>
+            <w:tcW w:w="2352" w:type="dxa"/>
+            <w:tcBorders/>
+          </w:tcPr>
+          <w:p>
+            <w:pPr>
+              <w:pStyle w:val="Compact"/>
+              <w:widowControl/>
+              <w:spacing w:before="36" w:after="36"/>
+              <w:jc w:val="left"/>
+              <w:rPr>
+                <w:rFonts w:ascii="Cambria" w:hAnsi="Cambria" w:eastAsia="Cambria" w:cs=""/>
+                <w:kern w:val="0"/>
+                <w:szCs w:val="24"/>
+                <w:lang w:val="en-US" w:eastAsia="en-US" w:bidi="ar-SA"/>
+              </w:rPr>
+            </w:pPr>
+            <w:r>
+              <w:rPr>
+                <w:rFonts w:eastAsia="Cambria" w:cs=""/>
+                <w:b/>
+                <w:bCs/>
+                <w:kern w:val="0"/>
+                <w:sz w:val="19"/>
+                <w:szCs w:val="24"/>
+                <w:lang w:val="en-US" w:eastAsia="en-US" w:bidi="ar-SA"/>
+              </w:rPr>
+              <w:t>Week 49</w:t>
+            </w:r>
+          </w:p>
+        </w:tc>
+        <w:tc>
+          <w:tcPr>
+            <w:tcW w:w="2351" w:type="dxa"/>
+            <w:tcBorders/>
+          </w:tcPr>
+          <w:p>
+            <w:pPr>
+              <w:pStyle w:val="Compact"/>
+              <w:widowControl/>
+              <w:spacing w:before="36" w:after="36"/>
+              <w:jc w:val="left"/>
+              <w:rPr>
+                <w:rFonts w:ascii="Cambria" w:hAnsi="Cambria" w:eastAsia="Cambria" w:cs=""/>
+                <w:kern w:val="0"/>
+                <w:szCs w:val="24"/>
+                <w:lang w:val="en-US" w:eastAsia="en-US" w:bidi="ar-SA"/>
+              </w:rPr>
+            </w:pPr>
+            <w:r>
+              <w:rPr>
+                <w:rFonts w:eastAsia="Cambria" w:cs=""/>
+                <w:kern w:val="0"/>
+                <w:sz w:val="19"/>
+                <w:szCs w:val="24"/>
+                <w:lang w:val="en-US" w:eastAsia="en-US" w:bidi="ar-SA"/>
+              </w:rPr>
+              <w:t>Present the handover package to the Steering Committee.</w:t>
+            </w:r>
+          </w:p>
+        </w:tc>
+        <w:tc>
+          <w:tcPr>
+            <w:tcW w:w="2352" w:type="dxa"/>
+            <w:tcBorders/>
+          </w:tcPr>
+          <w:p>
+            <w:pPr>
+              <w:pStyle w:val="Compact"/>
+              <w:widowControl/>
+              <w:spacing w:before="36" w:after="36"/>
+              <w:jc w:val="left"/>
+              <w:rPr>
+                <w:rFonts w:ascii="Cambria" w:hAnsi="Cambria" w:eastAsia="Cambria" w:cs=""/>
+                <w:kern w:val="0"/>
+                <w:szCs w:val="24"/>
+                <w:lang w:val="en-US" w:eastAsia="en-US" w:bidi="ar-SA"/>
+              </w:rPr>
+            </w:pPr>
+            <w:r>
+              <w:rPr>
+                <w:rFonts w:eastAsia="Cambria" w:cs=""/>
+                <w:kern w:val="0"/>
+                <w:sz w:val="19"/>
+                <w:szCs w:val="24"/>
+                <w:lang w:val="en-US" w:eastAsia="en-US" w:bidi="ar-SA"/>
+              </w:rPr>
+              <w:t>—</w:t>
+            </w:r>
+          </w:p>
+        </w:tc>
+        <w:tc>
+          <w:tcPr>
+            <w:tcW w:w="2353" w:type="dxa"/>
+            <w:tcBorders/>
+          </w:tcPr>
+          <w:p>
+            <w:pPr>
+              <w:pStyle w:val="Compact"/>
+              <w:widowControl/>
+              <w:spacing w:before="36" w:after="36"/>
+              <w:jc w:val="left"/>
+              <w:rPr>
+                <w:rFonts w:ascii="Cambria" w:hAnsi="Cambria" w:eastAsia="Cambria" w:cs=""/>
+                <w:kern w:val="0"/>
+                <w:szCs w:val="24"/>
+                <w:lang w:val="en-US" w:eastAsia="en-US" w:bidi="ar-SA"/>
+              </w:rPr>
+            </w:pPr>
+            <w:r>
+              <w:rPr>
+                <w:rFonts w:eastAsia="Cambria" w:cs=""/>
+                <w:kern w:val="0"/>
+                <w:sz w:val="19"/>
+                <w:szCs w:val="24"/>
+                <w:lang w:val="en-US" w:eastAsia="en-US" w:bidi="ar-SA"/>
+              </w:rPr>
+              <w:t>M21 — routine log.</w:t>
             </w:r>
           </w:p>
         </w:tc>
@@ -16958,7 +19389,7 @@
         <w:pStyle w:val="Heading3"/>
         <w:rPr/>
       </w:pPr>
-      <w:bookmarkStart w:id="71" w:name="__RefHeading___Toc10409_1049687307"/>
+      <w:bookmarkStart w:id="71" w:name="__RefHeading___Toc6372_3532355311"/>
       <w:bookmarkStart w:id="72" w:name="Xc6b73c5214ce25f3e31cd7181b649bb6e2db9fd"/>
       <w:bookmarkEnd w:id="71"/>
       <w:r>
@@ -20743,7 +23174,7 @@
         <w:pStyle w:val="Heading3"/>
         <w:rPr/>
       </w:pPr>
-      <w:bookmarkStart w:id="74" w:name="__RefHeading___Toc10411_1049687307"/>
+      <w:bookmarkStart w:id="74" w:name="__RefHeading___Toc6374_3532355311"/>
       <w:bookmarkStart w:id="75" w:name="Xbfc2cab260ff0d2b037d8bdcc38cc8d05e3256b"/>
       <w:bookmarkEnd w:id="74"/>
       <w:r>
@@ -24526,7 +26957,7 @@
         <w:pStyle w:val="Heading3"/>
         <w:rPr/>
       </w:pPr>
-      <w:bookmarkStart w:id="77" w:name="__RefHeading___Toc10413_1049687307"/>
+      <w:bookmarkStart w:id="77" w:name="__RefHeading___Toc6376_3532355311"/>
       <w:bookmarkStart w:id="78" w:name="six-exceptions-in-detail"/>
       <w:bookmarkEnd w:id="77"/>
       <w:r>
@@ -25478,7 +27909,7 @@
         <w:pStyle w:val="Heading2"/>
         <w:rPr/>
       </w:pPr>
-      <w:bookmarkStart w:id="85" w:name="__RefHeading___Toc10415_1049687307"/>
+      <w:bookmarkStart w:id="85" w:name="__RefHeading___Toc6378_3532355311"/>
       <w:bookmarkStart w:id="86" w:name="X88044b7bff4ad5eade16550e78828af1bf84f9d"/>
       <w:bookmarkEnd w:id="85"/>
       <w:r>
@@ -25495,7 +27926,7 @@
         <w:pStyle w:val="Heading3"/>
         <w:rPr/>
       </w:pPr>
-      <w:bookmarkStart w:id="87" w:name="__RefHeading___Toc10417_1049687307"/>
+      <w:bookmarkStart w:id="87" w:name="__RefHeading___Toc6380_3532355311"/>
       <w:bookmarkStart w:id="88" w:name="what-this-training-covers"/>
       <w:bookmarkEnd w:id="87"/>
       <w:r>
@@ -25526,7 +27957,7 @@
         <w:pStyle w:val="Heading3"/>
         <w:rPr/>
       </w:pPr>
-      <w:bookmarkStart w:id="90" w:name="__RefHeading___Toc10419_1049687307"/>
+      <w:bookmarkStart w:id="90" w:name="__RefHeading___Toc6382_3532355311"/>
       <w:bookmarkEnd w:id="90"/>
       <w:r>
         <w:rPr>
@@ -26085,7 +28516,7 @@
         <w:pStyle w:val="Heading3"/>
         <w:rPr/>
       </w:pPr>
-      <w:bookmarkStart w:id="92" w:name="__RefHeading___Toc10421_1049687307"/>
+      <w:bookmarkStart w:id="92" w:name="__RefHeading___Toc6384_3532355311"/>
       <w:bookmarkEnd w:id="92"/>
       <w:r>
         <w:rPr>
@@ -26642,7 +29073,7 @@
         <w:pStyle w:val="Heading3"/>
         <w:rPr/>
       </w:pPr>
-      <w:bookmarkStart w:id="93" w:name="__RefHeading___Toc10423_1049687307"/>
+      <w:bookmarkStart w:id="93" w:name="__RefHeading___Toc6386_3532355311"/>
       <w:bookmarkEnd w:id="93"/>
       <w:r>
         <w:rPr>
@@ -27199,7 +29630,7 @@
         <w:pStyle w:val="Heading3"/>
         <w:rPr/>
       </w:pPr>
-      <w:bookmarkStart w:id="94" w:name="__RefHeading___Toc10425_1049687307"/>
+      <w:bookmarkStart w:id="94" w:name="__RefHeading___Toc6388_3532355311"/>
       <w:bookmarkEnd w:id="94"/>
       <w:r>
         <w:rPr>
@@ -27367,7 +29798,7 @@
     </w:r>
     <w:r>
       <w:rPr/>
-      <w:t>23</w:t>
+      <w:t>24</w:t>
     </w:r>
     <w:r>
       <w:rPr/>
@@ -27413,7 +29844,7 @@
     </w:r>
     <w:r>
       <w:rPr/>
-      <w:t>25</w:t>
+      <w:t>26</w:t>
     </w:r>
     <w:r>
       <w:rPr/>

</xml_diff>